<commit_message>
Split BLUEPRINT into parts, rebuild style guide
</commit_message>
<xml_diff>
--- a/Blueprint/BLUEPRINT.docx
+++ b/Blueprint/BLUEPRINT.docx
@@ -68,6 +68,663 @@
       <w:r>
         <w:t>This is why we have style...</w:t>
       </w:r>
+    </w:p>
+    <w:p>
+      <w:pPr>
+        <w:pStyle w:val="Heading2"/>
+        <w:keepNext/>
+      </w:pPr>
+      <w:r>
+        <w:t>CONTENTS</w:t>
+      </w:r>
+    </w:p>
+    <w:p>
+      <w:pPr>
+        <w:keepNext/>
+        <w:spacing w:after="20"/>
+        <w:ind w:left="0"/>
+      </w:pPr>
+      <w:hyperlink w:anchor="_bkp_toc_0">
+        <w:r>
+          <w:rPr>
+            <w:b/>
+            <w:sz w:val="19"/>
+          </w:rPr>
+          <w:t xml:space="preserve">EDITING</w:t>
+        </w:r>
+      </w:hyperlink>
+    </w:p>
+    <w:p>
+      <w:pPr>
+        <w:keepNext/>
+        <w:spacing w:after="20"/>
+        <w:ind w:left="317"/>
+      </w:pPr>
+      <w:hyperlink w:anchor="_bkp_toc_1">
+        <w:r>
+          <w:rPr>
+            <w:sz w:val="18"/>
+          </w:rPr>
+          <w:t xml:space="preserve">SOLVE THE PROBLEM</w:t>
+        </w:r>
+      </w:hyperlink>
+    </w:p>
+    <w:p>
+      <w:pPr>
+        <w:keepNext/>
+        <w:spacing w:after="20"/>
+        <w:ind w:left="634"/>
+      </w:pPr>
+      <w:hyperlink w:anchor="_bkp_toc_2">
+        <w:r>
+          <w:rPr>
+            <w:sz w:val="17"/>
+          </w:rPr>
+          <w:t xml:space="preserve">VERIFICATION AND PROXIMITY</w:t>
+        </w:r>
+      </w:hyperlink>
+    </w:p>
+    <w:p>
+      <w:pPr>
+        <w:keepNext/>
+        <w:spacing w:after="20"/>
+        <w:ind w:left="0"/>
+      </w:pPr>
+      <w:hyperlink w:anchor="_bkp_toc_3">
+        <w:r>
+          <w:rPr>
+            <w:b/>
+            <w:sz w:val="19"/>
+          </w:rPr>
+          <w:t xml:space="preserve">PROCESSES</w:t>
+        </w:r>
+      </w:hyperlink>
+    </w:p>
+    <w:p>
+      <w:pPr>
+        <w:keepNext/>
+        <w:spacing w:after="20"/>
+        <w:ind w:left="634"/>
+      </w:pPr>
+      <w:hyperlink w:anchor="_bkp_toc_4">
+        <w:r>
+          <w:rPr>
+            <w:sz w:val="17"/>
+          </w:rPr>
+          <w:t xml:space="preserve">CONVERSIONS</w:t>
+        </w:r>
+      </w:hyperlink>
+    </w:p>
+    <w:p>
+      <w:pPr>
+        <w:keepNext/>
+        <w:spacing w:after="20"/>
+        <w:ind w:left="950"/>
+      </w:pPr>
+      <w:hyperlink w:anchor="_bkp_toc_5">
+        <w:r>
+          <w:rPr>
+            <w:sz w:val="16"/>
+          </w:rPr>
+          <w:t xml:space="preserve">Numbers</w:t>
+        </w:r>
+      </w:hyperlink>
+    </w:p>
+    <w:p>
+      <w:pPr>
+        <w:keepNext/>
+        <w:spacing w:after="20"/>
+        <w:ind w:left="950"/>
+      </w:pPr>
+      <w:hyperlink w:anchor="_bkp_toc_6">
+        <w:r>
+          <w:rPr>
+            <w:sz w:val="16"/>
+          </w:rPr>
+          <w:t xml:space="preserve">Times</w:t>
+        </w:r>
+      </w:hyperlink>
+    </w:p>
+    <w:p>
+      <w:pPr>
+        <w:keepNext/>
+        <w:spacing w:after="20"/>
+        <w:ind w:left="950"/>
+      </w:pPr>
+      <w:hyperlink w:anchor="_bkp_toc_7">
+        <w:r>
+          <w:rPr>
+            <w:sz w:val="16"/>
+          </w:rPr>
+          <w:t xml:space="preserve">Dates</w:t>
+        </w:r>
+      </w:hyperlink>
+    </w:p>
+    <w:p>
+      <w:pPr>
+        <w:keepNext/>
+        <w:spacing w:after="20"/>
+        <w:ind w:left="950"/>
+      </w:pPr>
+      <w:hyperlink w:anchor="_bkp_toc_8">
+        <w:r>
+          <w:rPr>
+            <w:sz w:val="16"/>
+          </w:rPr>
+          <w:t xml:space="preserve">Datelines</w:t>
+        </w:r>
+      </w:hyperlink>
+    </w:p>
+    <w:p>
+      <w:pPr>
+        <w:keepNext/>
+        <w:spacing w:after="20"/>
+        <w:ind w:left="950"/>
+      </w:pPr>
+      <w:hyperlink w:anchor="_bkp_toc_9">
+        <w:r>
+          <w:rPr>
+            <w:sz w:val="16"/>
+          </w:rPr>
+          <w:t xml:space="preserve">Currency</w:t>
+        </w:r>
+      </w:hyperlink>
+    </w:p>
+    <w:p>
+      <w:pPr>
+        <w:keepNext/>
+        <w:spacing w:after="20"/>
+        <w:ind w:left="950"/>
+      </w:pPr>
+      <w:hyperlink w:anchor="_bkp_toc_10">
+        <w:r>
+          <w:rPr>
+            <w:sz w:val="16"/>
+          </w:rPr>
+          <w:t xml:space="preserve">Measurements</w:t>
+        </w:r>
+      </w:hyperlink>
+    </w:p>
+    <w:p>
+      <w:pPr>
+        <w:keepNext/>
+        <w:spacing w:after="20"/>
+        <w:ind w:left="950"/>
+      </w:pPr>
+      <w:hyperlink w:anchor="_bkp_toc_11">
+        <w:r>
+          <w:rPr>
+            <w:sz w:val="16"/>
+          </w:rPr>
+          <w:t xml:space="preserve">Names and honorifics</w:t>
+        </w:r>
+      </w:hyperlink>
+    </w:p>
+    <w:p>
+      <w:pPr>
+        <w:keepNext/>
+        <w:spacing w:after="20"/>
+        <w:ind w:left="950"/>
+      </w:pPr>
+      <w:hyperlink w:anchor="_bkp_toc_12">
+        <w:r>
+          <w:rPr>
+            <w:sz w:val="16"/>
+          </w:rPr>
+          <w:t xml:space="preserve">Acronyms</w:t>
+        </w:r>
+      </w:hyperlink>
+    </w:p>
+    <w:p>
+      <w:pPr>
+        <w:keepNext/>
+        <w:spacing w:after="20"/>
+        <w:ind w:left="950"/>
+      </w:pPr>
+      <w:hyperlink w:anchor="_bkp_toc_13">
+        <w:r>
+          <w:rPr>
+            <w:sz w:val="16"/>
+          </w:rPr>
+          <w:t xml:space="preserve">Country abbreviations in heads</w:t>
+        </w:r>
+      </w:hyperlink>
+    </w:p>
+    <w:p>
+      <w:pPr>
+        <w:keepNext/>
+        <w:spacing w:after="20"/>
+        <w:ind w:left="634"/>
+      </w:pPr>
+      <w:hyperlink w:anchor="_bkp_toc_14">
+        <w:r>
+          <w:rPr>
+            <w:sz w:val="17"/>
+          </w:rPr>
+          <w:t xml:space="preserve">Scope</w:t>
+        </w:r>
+      </w:hyperlink>
+    </w:p>
+    <w:p>
+      <w:pPr>
+        <w:keepNext/>
+        <w:spacing w:after="20"/>
+        <w:ind w:left="950"/>
+      </w:pPr>
+      <w:hyperlink w:anchor="_bkp_toc_15">
+        <w:r>
+          <w:rPr>
+            <w:sz w:val="16"/>
+          </w:rPr>
+          <w:t xml:space="preserve">Length</w:t>
+        </w:r>
+      </w:hyperlink>
+    </w:p>
+    <w:p>
+      <w:pPr>
+        <w:keepNext/>
+        <w:spacing w:after="20"/>
+        <w:ind w:left="634"/>
+      </w:pPr>
+      <w:hyperlink w:anchor="_bkp_toc_16">
+        <w:r>
+          <w:rPr>
+            <w:sz w:val="17"/>
+          </w:rPr>
+          <w:t xml:space="preserve">PR copy</w:t>
+        </w:r>
+      </w:hyperlink>
+    </w:p>
+    <w:p>
+      <w:pPr>
+        <w:keepNext/>
+        <w:spacing w:after="20"/>
+        <w:ind w:left="317"/>
+      </w:pPr>
+      <w:hyperlink w:anchor="_bkp_toc_17">
+        <w:r>
+          <w:rPr>
+            <w:sz w:val="18"/>
+          </w:rPr>
+          <w:t xml:space="preserve">OUTPUT</w:t>
+        </w:r>
+      </w:hyperlink>
+    </w:p>
+    <w:p>
+      <w:pPr>
+        <w:keepNext/>
+        <w:spacing w:after="20"/>
+        <w:ind w:left="634"/>
+      </w:pPr>
+      <w:hyperlink w:anchor="_bkp_toc_18">
+        <w:r>
+          <w:rPr>
+            <w:sz w:val="17"/>
+          </w:rPr>
+          <w:t xml:space="preserve">JOB REPORT</w:t>
+        </w:r>
+      </w:hyperlink>
+    </w:p>
+    <w:p>
+      <w:pPr>
+        <w:keepNext/>
+        <w:spacing w:after="20"/>
+        <w:ind w:left="634"/>
+      </w:pPr>
+      <w:hyperlink w:anchor="_bkp_toc_19">
+        <w:r>
+          <w:rPr>
+            <w:sz w:val="17"/>
+          </w:rPr>
+          <w:t xml:space="preserve">FORMAT</w:t>
+        </w:r>
+      </w:hyperlink>
+    </w:p>
+    <w:p>
+      <w:pPr>
+        <w:keepNext/>
+        <w:spacing w:after="20"/>
+        <w:ind w:left="634"/>
+      </w:pPr>
+      <w:hyperlink w:anchor="_bkp_toc_20">
+        <w:r>
+          <w:rPr>
+            <w:sz w:val="17"/>
+          </w:rPr>
+          <w:t xml:space="preserve">STYLE LOG</w:t>
+        </w:r>
+      </w:hyperlink>
+    </w:p>
+    <w:p>
+      <w:pPr>
+        <w:keepNext/>
+        <w:spacing w:after="20"/>
+        <w:ind w:left="634"/>
+      </w:pPr>
+      <w:hyperlink w:anchor="_bkp_toc_21">
+        <w:r>
+          <w:rPr>
+            <w:sz w:val="17"/>
+          </w:rPr>
+          <w:t xml:space="preserve">REFERENCES</w:t>
+        </w:r>
+      </w:hyperlink>
+    </w:p>
+    <w:p>
+      <w:pPr>
+        <w:keepNext/>
+        <w:spacing w:after="20"/>
+        <w:ind w:left="634"/>
+      </w:pPr>
+      <w:hyperlink w:anchor="_bkp_toc_22">
+        <w:r>
+          <w:rPr>
+            <w:sz w:val="17"/>
+          </w:rPr>
+          <w:t xml:space="preserve">UNRESOLVED</w:t>
+        </w:r>
+      </w:hyperlink>
+    </w:p>
+    <w:p>
+      <w:pPr>
+        <w:keepNext/>
+        <w:spacing w:after="20"/>
+        <w:ind w:left="0"/>
+      </w:pPr>
+      <w:hyperlink w:anchor="_bkp_toc_23">
+        <w:r>
+          <w:rPr>
+            <w:b/>
+            <w:sz w:val="19"/>
+          </w:rPr>
+          <w:t xml:space="preserve">STATUS</w:t>
+        </w:r>
+      </w:hyperlink>
+    </w:p>
+    <w:p>
+      <w:pPr>
+        <w:keepNext/>
+        <w:spacing w:after="20"/>
+        <w:ind w:left="317"/>
+      </w:pPr>
+      <w:hyperlink w:anchor="_bkp_toc_24">
+        <w:r>
+          <w:rPr>
+            <w:sz w:val="18"/>
+          </w:rPr>
+          <w:t xml:space="preserve">APEX FIGURES</w:t>
+        </w:r>
+      </w:hyperlink>
+    </w:p>
+    <w:p>
+      <w:pPr>
+        <w:keepNext/>
+        <w:spacing w:after="20"/>
+        <w:ind w:left="317"/>
+      </w:pPr>
+      <w:hyperlink w:anchor="_bkp_toc_25">
+        <w:r>
+          <w:rPr>
+            <w:sz w:val="18"/>
+          </w:rPr>
+          <w:t xml:space="preserve">SECOND TIER</w:t>
+        </w:r>
+      </w:hyperlink>
+    </w:p>
+    <w:p>
+      <w:pPr>
+        <w:keepNext/>
+        <w:spacing w:after="20"/>
+        <w:ind w:left="634"/>
+      </w:pPr>
+      <w:hyperlink w:anchor="_bkp_toc_26">
+        <w:r>
+          <w:rPr>
+            <w:sz w:val="17"/>
+          </w:rPr>
+          <w:t xml:space="preserve">MORTALITIES AND SUCCESSIONS</w:t>
+        </w:r>
+      </w:hyperlink>
+    </w:p>
+    <w:p>
+      <w:pPr>
+        <w:keepNext/>
+        <w:spacing w:after="20"/>
+        <w:ind w:left="634"/>
+      </w:pPr>
+      <w:hyperlink w:anchor="_bkp_toc_27">
+        <w:r>
+          <w:rPr>
+            <w:sz w:val="17"/>
+          </w:rPr>
+          <w:t xml:space="preserve">CORPORATE LEADERSHIP CHANGES</w:t>
+        </w:r>
+      </w:hyperlink>
+    </w:p>
+    <w:p>
+      <w:pPr>
+        <w:keepNext/>
+        <w:spacing w:after="20"/>
+        <w:ind w:left="317"/>
+      </w:pPr>
+      <w:hyperlink w:anchor="_bkp_toc_28">
+        <w:r>
+          <w:rPr>
+            <w:sz w:val="18"/>
+          </w:rPr>
+          <w:t xml:space="preserve">GLOBAL FIGURES</w:t>
+        </w:r>
+      </w:hyperlink>
+    </w:p>
+    <w:p>
+      <w:pPr>
+        <w:keepNext/>
+        <w:spacing w:after="20"/>
+        <w:ind w:left="0"/>
+      </w:pPr>
+      <w:hyperlink w:anchor="_bkp_toc_29">
+        <w:r>
+          <w:rPr>
+            <w:b/>
+            <w:sz w:val="19"/>
+          </w:rPr>
+          <w:t xml:space="preserve">REFS</w:t>
+        </w:r>
+      </w:hyperlink>
+    </w:p>
+    <w:p>
+      <w:pPr>
+        <w:keepNext/>
+        <w:spacing w:after="20"/>
+        <w:ind w:left="317"/>
+      </w:pPr>
+      <w:hyperlink w:anchor="_bkp_toc_30">
+        <w:r>
+          <w:rPr>
+            <w:sz w:val="18"/>
+          </w:rPr>
+          <w:t xml:space="preserve">COUNTRIES</w:t>
+        </w:r>
+      </w:hyperlink>
+    </w:p>
+    <w:p>
+      <w:pPr>
+        <w:keepNext/>
+        <w:spacing w:after="20"/>
+        <w:ind w:left="634"/>
+      </w:pPr>
+      <w:hyperlink w:anchor="_bkp_toc_31">
+        <w:r>
+          <w:rPr>
+            <w:sz w:val="17"/>
+          </w:rPr>
+          <w:t xml:space="preserve">PREFERRED FORMS</w:t>
+        </w:r>
+      </w:hyperlink>
+    </w:p>
+    <w:p>
+      <w:pPr>
+        <w:keepNext/>
+        <w:spacing w:after="20"/>
+        <w:ind w:left="634"/>
+      </w:pPr>
+      <w:hyperlink w:anchor="_bkp_toc_32">
+        <w:r>
+          <w:rPr>
+            <w:sz w:val="17"/>
+          </w:rPr>
+          <w:t xml:space="preserve">ADJECTIVAL / DEMONYM TRAPS</w:t>
+        </w:r>
+      </w:hyperlink>
+    </w:p>
+    <w:p>
+      <w:pPr>
+        <w:keepNext/>
+        <w:spacing w:after="20"/>
+        <w:ind w:left="634"/>
+      </w:pPr>
+      <w:hyperlink w:anchor="_bkp_toc_33">
+        <w:r>
+          <w:rPr>
+            <w:sz w:val="17"/>
+          </w:rPr>
+          <w:t xml:space="preserve">CAPITALS AND COUNTRY STRUCTURE</w:t>
+        </w:r>
+      </w:hyperlink>
+    </w:p>
+    <w:p>
+      <w:pPr>
+        <w:keepNext/>
+        <w:spacing w:after="20"/>
+        <w:ind w:left="634"/>
+      </w:pPr>
+      <w:hyperlink w:anchor="_bkp_toc_34">
+        <w:r>
+          <w:rPr>
+            <w:sz w:val="17"/>
+          </w:rPr>
+          <w:t xml:space="preserve">HEADLINE ABBREVIATION FORMS</w:t>
+        </w:r>
+      </w:hyperlink>
+    </w:p>
+    <w:p>
+      <w:pPr>
+        <w:keepNext/>
+        <w:spacing w:after="20"/>
+        <w:ind w:left="317"/>
+      </w:pPr>
+      <w:hyperlink w:anchor="_bkp_toc_35">
+        <w:r>
+          <w:rPr>
+            <w:sz w:val="18"/>
+          </w:rPr>
+          <w:t xml:space="preserve">FOREIGN PLACES</w:t>
+        </w:r>
+      </w:hyperlink>
+    </w:p>
+    <w:p>
+      <w:pPr>
+        <w:keepNext/>
+        <w:spacing w:after="20"/>
+        <w:ind w:left="317"/>
+      </w:pPr>
+      <w:hyperlink w:anchor="_bkp_toc_36">
+        <w:r>
+          <w:rPr>
+            <w:sz w:val="18"/>
+          </w:rPr>
+          <w:t xml:space="preserve">THAI PLACES</w:t>
+        </w:r>
+      </w:hyperlink>
+    </w:p>
+    <w:p>
+      <w:pPr>
+        <w:keepNext/>
+        <w:spacing w:after="20"/>
+        <w:ind w:left="634"/>
+      </w:pPr>
+      <w:hyperlink w:anchor="_bkp_toc_37">
+        <w:r>
+          <w:rPr>
+            <w:sz w:val="17"/>
+          </w:rPr>
+          <w:t xml:space="preserve">PROVINCES</w:t>
+        </w:r>
+      </w:hyperlink>
+    </w:p>
+    <w:p>
+      <w:pPr>
+        <w:keepNext/>
+        <w:spacing w:after="20"/>
+        <w:ind w:left="317"/>
+      </w:pPr>
+      <w:hyperlink w:anchor="_bkp_toc_38">
+        <w:r>
+          <w:rPr>
+            <w:sz w:val="18"/>
+          </w:rPr>
+          <w:t xml:space="preserve">ORGANISATIONS</w:t>
+        </w:r>
+      </w:hyperlink>
+    </w:p>
+    <w:p>
+      <w:pPr>
+        <w:keepNext/>
+        <w:spacing w:after="20"/>
+        <w:ind w:left="317"/>
+      </w:pPr>
+      <w:hyperlink w:anchor="_bkp_toc_39">
+        <w:r>
+          <w:rPr>
+            <w:sz w:val="18"/>
+          </w:rPr>
+          <w:t xml:space="preserve">VOCABULARY &amp; SPELLING</w:t>
+        </w:r>
+      </w:hyperlink>
+    </w:p>
+    <w:p>
+      <w:pPr>
+        <w:keepNext/>
+        <w:spacing w:after="20"/>
+        <w:ind w:left="634"/>
+      </w:pPr>
+      <w:hyperlink w:anchor="_bkp_toc_40">
+        <w:r>
+          <w:rPr>
+            <w:sz w:val="17"/>
+          </w:rPr>
+          <w:t xml:space="preserve">NUMBERS AND SYMBOLS</w:t>
+        </w:r>
+      </w:hyperlink>
+    </w:p>
+    <w:p>
+      <w:pPr>
+        <w:keepNext/>
+        <w:spacing w:after="20"/>
+        <w:ind w:left="634"/>
+      </w:pPr>
+      <w:hyperlink w:anchor="_bkp_toc_41">
+        <w:r>
+          <w:rPr>
+            <w:sz w:val="17"/>
+          </w:rPr>
+          <w:t xml:space="preserve">UK VS US TRAPS</w:t>
+        </w:r>
+      </w:hyperlink>
+    </w:p>
+    <w:p>
+      <w:pPr>
+        <w:spacing w:after="20"/>
+        <w:ind w:left="634"/>
+      </w:pPr>
+      <w:hyperlink w:anchor="_bkp_toc_42">
+        <w:r>
+          <w:rPr>
+            <w:sz w:val="17"/>
+          </w:rPr>
+          <w:t xml:space="preserve">VOCABULARY RULINGS</w:t>
+        </w:r>
+      </w:hyperlink>
     </w:p>
     <w:p>
       <w:pPr>
@@ -202,6 +859,7 @@
       </w:r>
     </w:p>
     <w:p>
+      <w:bookmarkStart w:id="9000" w:name="_bkp_toc_0"/>
       <w:pPr>
         <w:pStyle w:val="Heading1"/>
         <w:spacing w:after="0"/>
@@ -209,6 +867,7 @@
       <w:r>
         <w:t>EDITING</w:t>
       </w:r>
+      <w:bookmarkEnd w:id="9000"/>
     </w:p>
     <w:p>
       <w:pPr>
@@ -243,6 +902,7 @@
       </w:r>
     </w:p>
     <w:p>
+      <w:bookmarkStart w:id="9001" w:name="_bkp_toc_1"/>
       <w:pPr>
         <w:pStyle w:val="Heading2"/>
       </w:pPr>
@@ -273,6 +933,7 @@
         </w:rPr>
         <w:t>PROBLEM</w:t>
       </w:r>
+      <w:bookmarkEnd w:id="9001"/>
     </w:p>
     <w:p>
       <w:pPr/>
@@ -1275,6 +1936,7 @@
       </w:r>
     </w:p>
     <w:p>
+      <w:bookmarkStart w:id="9002" w:name="_bkp_toc_2"/>
       <w:pPr>
         <w:pStyle w:val="Heading3"/>
       </w:pPr>
@@ -1305,6 +1967,7 @@
         </w:rPr>
         <w:t>PROXIMITY</w:t>
       </w:r>
+      <w:bookmarkEnd w:id="9002"/>
     </w:p>
     <w:p>
       <w:pPr/>
@@ -2243,7 +2906,7 @@
           <w:b w:val="0"/>
           <w:i w:val="0"/>
         </w:rPr>
-        <w:t>at</w:t>
+        <w:t>in</w:t>
       </w:r>
       <w:r>
         <w:t xml:space="preserve"> </w:t>
@@ -2263,47 +2926,37 @@
           <w:b w:val="0"/>
           <w:i w:val="0"/>
         </w:rPr>
-        <w:t>bottom</w:t>
-      </w:r>
-      <w:r>
-        <w:t xml:space="preserve"> </w:t>
-      </w:r>
-      <w:r>
-        <w:rPr>
-          <w:b w:val="0"/>
-          <w:i w:val="0"/>
-        </w:rPr>
-        <w:t>of</w:t>
-      </w:r>
-      <w:r>
-        <w:t xml:space="preserve"> </w:t>
-      </w:r>
-      <w:r>
-        <w:rPr>
-          <w:b w:val="0"/>
-          <w:i w:val="0"/>
-        </w:rPr>
-        <w:t>the</w:t>
-      </w:r>
-      <w:r>
-        <w:t xml:space="preserve"> </w:t>
-      </w:r>
-      <w:r>
-        <w:rPr>
-          <w:b w:val="0"/>
-          <w:i w:val="0"/>
-        </w:rPr>
-        <w:t>STYLE</w:t>
-      </w:r>
-      <w:r>
-        <w:t xml:space="preserve"> </w:t>
-      </w:r>
-      <w:r>
-        <w:rPr>
-          <w:b w:val="0"/>
-          <w:i w:val="0"/>
-        </w:rPr>
-        <w:t>LOG</w:t>
+        <w:t>Job</w:t>
+      </w:r>
+      <w:r>
+        <w:t xml:space="preserve"> </w:t>
+      </w:r>
+      <w:r>
+        <w:rPr>
+          <w:b w:val="0"/>
+          <w:i w:val="0"/>
+        </w:rPr>
+        <w:t>Report's</w:t>
+      </w:r>
+      <w:r>
+        <w:t xml:space="preserve"> </w:t>
+      </w:r>
+      <w:r>
+        <w:rPr>
+          <w:b w:val="0"/>
+          <w:i w:val="0"/>
+        </w:rPr>
+        <w:t>REFERENCES</w:t>
+      </w:r>
+      <w:r>
+        <w:t xml:space="preserve"> </w:t>
+      </w:r>
+      <w:r>
+        <w:rPr>
+          <w:b w:val="0"/>
+          <w:i w:val="0"/>
+        </w:rPr>
+        <w:t>module</w:t>
       </w:r>
       <w:r>
         <w:t xml:space="preserve"> </w:t>
@@ -3260,6 +3913,7 @@
       </w:r>
     </w:p>
     <w:p>
+      <w:bookmarkStart w:id="9003" w:name="_bkp_toc_3"/>
       <w:pPr>
         <w:pStyle w:val="Heading1"/>
         <w:spacing w:after="0"/>
@@ -3268,6 +3922,7 @@
       <w:r>
         <w:t>PROCESSES</w:t>
       </w:r>
+      <w:bookmarkEnd w:id="9003"/>
     </w:p>
     <w:p>
       <w:pPr>
@@ -3313,6 +3968,7 @@
       </w:r>
     </w:p>
     <w:p>
+      <w:bookmarkStart w:id="9004" w:name="_bkp_toc_4"/>
       <w:pPr>
         <w:pStyle w:val="Heading3"/>
       </w:pPr>
@@ -3323,8 +3979,10 @@
         </w:rPr>
         <w:t>CONVERSIONS</w:t>
       </w:r>
-    </w:p>
-    <w:p>
+      <w:bookmarkEnd w:id="9004"/>
+    </w:p>
+    <w:p>
+      <w:bookmarkStart w:id="9005" w:name="_bkp_toc_5"/>
       <w:pPr>
         <w:pStyle w:val="Heading4"/>
       </w:pPr>
@@ -3335,6 +3993,7 @@
         </w:rPr>
         <w:t>Numbers</w:t>
       </w:r>
+      <w:bookmarkEnd w:id="9005"/>
     </w:p>
     <w:p>
       <w:pPr/>
@@ -4747,6 +5406,7 @@
       </w:r>
     </w:p>
     <w:p>
+      <w:bookmarkStart w:id="9006" w:name="_bkp_toc_6"/>
       <w:pPr>
         <w:pStyle w:val="Heading4"/>
       </w:pPr>
@@ -4757,6 +5417,7 @@
         </w:rPr>
         <w:t>Times</w:t>
       </w:r>
+      <w:bookmarkEnd w:id="9006"/>
     </w:p>
     <w:p>
       <w:pPr/>
@@ -5359,6 +6020,7 @@
       </w:r>
     </w:p>
     <w:p>
+      <w:bookmarkStart w:id="9007" w:name="_bkp_toc_7"/>
       <w:pPr>
         <w:pStyle w:val="Heading4"/>
       </w:pPr>
@@ -5369,6 +6031,7 @@
         </w:rPr>
         <w:t>Dates</w:t>
       </w:r>
+      <w:bookmarkEnd w:id="9007"/>
     </w:p>
     <w:p>
       <w:pPr/>
@@ -7959,6 +8622,7 @@
       </w:r>
     </w:p>
     <w:p>
+      <w:bookmarkStart w:id="9008" w:name="_bkp_toc_8"/>
       <w:pPr>
         <w:pStyle w:val="Heading4"/>
       </w:pPr>
@@ -7969,6 +8633,7 @@
         </w:rPr>
         <w:t>Datelines</w:t>
       </w:r>
+      <w:bookmarkEnd w:id="9008"/>
     </w:p>
     <w:p>
       <w:pPr/>
@@ -8201,6 +8866,7 @@
       </w:r>
     </w:p>
     <w:p>
+      <w:bookmarkStart w:id="9009" w:name="_bkp_toc_9"/>
       <w:pPr>
         <w:pStyle w:val="Heading4"/>
       </w:pPr>
@@ -8211,6 +8877,7 @@
         </w:rPr>
         <w:t>Currency</w:t>
       </w:r>
+      <w:bookmarkEnd w:id="9009"/>
     </w:p>
     <w:p>
       <w:pPr/>
@@ -9183,6 +9850,7 @@
       </w:r>
     </w:p>
     <w:p>
+      <w:bookmarkStart w:id="9010" w:name="_bkp_toc_10"/>
       <w:pPr>
         <w:pStyle w:val="Heading4"/>
       </w:pPr>
@@ -9193,6 +9861,7 @@
         </w:rPr>
         <w:t>Measurements</w:t>
       </w:r>
+      <w:bookmarkEnd w:id="9010"/>
     </w:p>
     <w:p>
       <w:pPr/>
@@ -9805,6 +10474,7 @@
       </w:r>
     </w:p>
     <w:p>
+      <w:bookmarkStart w:id="9011" w:name="_bkp_toc_11"/>
       <w:pPr>
         <w:pStyle w:val="Heading4"/>
       </w:pPr>
@@ -9835,6 +10505,7 @@
         </w:rPr>
         <w:t>honorifics</w:t>
       </w:r>
+      <w:bookmarkEnd w:id="9011"/>
     </w:p>
     <w:p>
       <w:pPr/>
@@ -16256,6 +16927,7 @@
       </w:r>
     </w:p>
     <w:p>
+      <w:bookmarkStart w:id="9012" w:name="_bkp_toc_12"/>
       <w:pPr>
         <w:pStyle w:val="Heading4"/>
       </w:pPr>
@@ -16266,6 +16938,7 @@
         </w:rPr>
         <w:t>Acronyms</w:t>
       </w:r>
+      <w:bookmarkEnd w:id="9012"/>
     </w:p>
     <w:p>
       <w:pPr/>
@@ -16548,6 +17221,7 @@
       </w:r>
     </w:p>
     <w:p>
+      <w:bookmarkStart w:id="9013" w:name="_bkp_toc_13"/>
       <w:pPr>
         <w:pStyle w:val="Heading4"/>
       </w:pPr>
@@ -16588,6 +17262,7 @@
         </w:rPr>
         <w:t>heads</w:t>
       </w:r>
+      <w:bookmarkEnd w:id="9013"/>
     </w:p>
     <w:p>
       <w:pPr/>
@@ -16950,6 +17625,7 @@
       </w:r>
     </w:p>
     <w:p>
+      <w:bookmarkStart w:id="9014" w:name="_bkp_toc_14"/>
       <w:pPr>
         <w:pStyle w:val="Heading3"/>
       </w:pPr>
@@ -16960,8 +17636,10 @@
         </w:rPr>
         <w:t>Scope</w:t>
       </w:r>
-    </w:p>
-    <w:p>
+      <w:bookmarkEnd w:id="9014"/>
+    </w:p>
+    <w:p>
+      <w:bookmarkStart w:id="9015" w:name="_bkp_toc_15"/>
       <w:pPr>
         <w:pStyle w:val="Heading4"/>
       </w:pPr>
@@ -16972,6 +17650,7 @@
         </w:rPr>
         <w:t>Length</w:t>
       </w:r>
+      <w:bookmarkEnd w:id="9015"/>
     </w:p>
     <w:p>
       <w:pPr/>
@@ -21985,6 +22664,7 @@
       </w:r>
     </w:p>
     <w:p>
+      <w:bookmarkStart w:id="9016" w:name="_bkp_toc_16"/>
       <w:pPr>
         <w:pStyle w:val="Heading3"/>
       </w:pPr>
@@ -22005,6 +22685,7 @@
         </w:rPr>
         <w:t>copy</w:t>
       </w:r>
+      <w:bookmarkEnd w:id="9016"/>
     </w:p>
     <w:p>
       <w:pPr/>
@@ -23152,6 +23833,7 @@
       </w:r>
     </w:p>
     <w:p>
+      <w:bookmarkStart w:id="9017" w:name="_bkp_toc_17"/>
       <w:pPr>
         <w:pStyle w:val="Heading2"/>
       </w:pPr>
@@ -23162,8 +23844,10 @@
         </w:rPr>
         <w:t>OUTPUT</w:t>
       </w:r>
-    </w:p>
-    <w:p>
+      <w:bookmarkEnd w:id="9017"/>
+    </w:p>
+    <w:p>
+      <w:bookmarkStart w:id="9018" w:name="_bkp_toc_18"/>
       <w:pPr>
         <w:pStyle w:val="Heading3"/>
       </w:pPr>
@@ -23172,8 +23856,743 @@
           <w:b w:val="0"/>
           <w:i w:val="0"/>
         </w:rPr>
+        <w:t>JOB</w:t>
+      </w:r>
+      <w:r>
+        <w:t xml:space="preserve"> </w:t>
+      </w:r>
+      <w:r>
+        <w:rPr>
+          <w:b w:val="0"/>
+          <w:i w:val="0"/>
+        </w:rPr>
+        <w:t>REPORT</w:t>
+      </w:r>
+      <w:bookmarkEnd w:id="9018"/>
+    </w:p>
+    <w:p>
+      <w:pPr/>
+      <w:r>
+        <w:rPr>
+          <w:b w:val="0"/>
+          <w:i w:val="0"/>
+        </w:rPr>
+        <w:t>Every</w:t>
+      </w:r>
+      <w:r>
+        <w:t xml:space="preserve"> </w:t>
+      </w:r>
+      <w:r>
+        <w:rPr>
+          <w:b w:val="0"/>
+          <w:i w:val="0"/>
+        </w:rPr>
+        <w:t>completed</w:t>
+      </w:r>
+      <w:r>
+        <w:t xml:space="preserve"> </w:t>
+      </w:r>
+      <w:r>
+        <w:rPr>
+          <w:b w:val="0"/>
+          <w:i w:val="0"/>
+        </w:rPr>
+        <w:t>edit</w:t>
+      </w:r>
+      <w:r>
+        <w:t xml:space="preserve"> </w:t>
+      </w:r>
+      <w:r>
+        <w:rPr>
+          <w:b w:val="0"/>
+          <w:i w:val="0"/>
+        </w:rPr>
+        <w:t>is</w:t>
+      </w:r>
+      <w:r>
+        <w:t xml:space="preserve"> </w:t>
+      </w:r>
+      <w:r>
+        <w:rPr>
+          <w:b w:val="0"/>
+          <w:i w:val="0"/>
+        </w:rPr>
+        <w:t>one</w:t>
+      </w:r>
+      <w:r>
+        <w:t xml:space="preserve"> </w:t>
+      </w:r>
+      <w:r>
+        <w:rPr>
+          <w:b w:val="0"/>
+          <w:i w:val="0"/>
+        </w:rPr>
+        <w:t>JOB</w:t>
+      </w:r>
+      <w:r>
+        <w:t xml:space="preserve"> </w:t>
+      </w:r>
+      <w:r>
+        <w:rPr>
+          <w:b w:val="0"/>
+          <w:i w:val="0"/>
+        </w:rPr>
+        <w:t>REPORT,</w:t>
+      </w:r>
+      <w:r>
+        <w:t xml:space="preserve"> </w:t>
+      </w:r>
+      <w:r>
+        <w:rPr>
+          <w:b w:val="0"/>
+          <w:i w:val="0"/>
+        </w:rPr>
+        <w:t>identified</w:t>
+      </w:r>
+      <w:r>
+        <w:t xml:space="preserve"> </w:t>
+      </w:r>
+      <w:r>
+        <w:rPr>
+          <w:b w:val="0"/>
+          <w:i w:val="0"/>
+        </w:rPr>
+        <w:t>by</w:t>
+      </w:r>
+      <w:r>
+        <w:t xml:space="preserve"> </w:t>
+      </w:r>
+      <w:r>
+        <w:rPr>
+          <w:b w:val="0"/>
+          <w:i w:val="0"/>
+        </w:rPr>
+        <w:t>the</w:t>
+      </w:r>
+      <w:r>
+        <w:t xml:space="preserve"> </w:t>
+      </w:r>
+      <w:r>
+        <w:rPr>
+          <w:b w:val="0"/>
+          <w:i w:val="0"/>
+        </w:rPr>
+        <w:t>slug</w:t>
+      </w:r>
+      <w:r>
+        <w:t xml:space="preserve"> </w:t>
+      </w:r>
+      <w:r>
+        <w:rPr>
+          <w:b w:val="0"/>
+          <w:i w:val="0"/>
+        </w:rPr>
+        <w:t>as</w:t>
+      </w:r>
+      <w:r>
+        <w:t xml:space="preserve"> </w:t>
+      </w:r>
+      <w:r>
+        <w:rPr>
+          <w:b w:val="0"/>
+          <w:i w:val="0"/>
+        </w:rPr>
+        <w:t>filed.</w:t>
+      </w:r>
+      <w:r>
+        <w:t xml:space="preserve"> </w:t>
+      </w:r>
+      <w:r>
+        <w:rPr>
+          <w:b w:val="0"/>
+          <w:i w:val="0"/>
+        </w:rPr>
+        <w:t>The</w:t>
+      </w:r>
+      <w:r>
+        <w:t xml:space="preserve"> </w:t>
+      </w:r>
+      <w:r>
+        <w:rPr>
+          <w:b w:val="0"/>
+          <w:i w:val="0"/>
+        </w:rPr>
+        <w:t>report's</w:t>
+      </w:r>
+      <w:r>
+        <w:t xml:space="preserve"> </w:t>
+      </w:r>
+      <w:r>
+        <w:rPr>
+          <w:b w:val="0"/>
+          <w:i w:val="0"/>
+        </w:rPr>
+        <w:t>existence</w:t>
+      </w:r>
+      <w:r>
+        <w:t xml:space="preserve"> </w:t>
+      </w:r>
+      <w:r>
+        <w:rPr>
+          <w:b w:val="0"/>
+          <w:i w:val="0"/>
+        </w:rPr>
+        <w:t>means</w:t>
+      </w:r>
+      <w:r>
+        <w:t xml:space="preserve"> </w:t>
+      </w:r>
+      <w:r>
+        <w:rPr>
+          <w:b w:val="0"/>
+          <w:i w:val="0"/>
+        </w:rPr>
+        <w:t>the</w:t>
+      </w:r>
+      <w:r>
+        <w:t xml:space="preserve"> </w:t>
+      </w:r>
+      <w:r>
+        <w:rPr>
+          <w:b w:val="0"/>
+          <w:i w:val="0"/>
+        </w:rPr>
+        <w:t>edit</w:t>
+      </w:r>
+      <w:r>
+        <w:t xml:space="preserve"> </w:t>
+      </w:r>
+      <w:r>
+        <w:rPr>
+          <w:b w:val="0"/>
+          <w:i w:val="0"/>
+        </w:rPr>
+        <w:t>is</w:t>
+      </w:r>
+      <w:r>
+        <w:t xml:space="preserve"> </w:t>
+      </w:r>
+      <w:r>
+        <w:rPr>
+          <w:b w:val="0"/>
+          <w:i w:val="0"/>
+        </w:rPr>
+        <w:t>complete</w:t>
+      </w:r>
+      <w:r>
+        <w:t xml:space="preserve"> </w:t>
+      </w:r>
+      <w:r>
+        <w:rPr>
+          <w:b w:val="0"/>
+          <w:i w:val="0"/>
+        </w:rPr>
+        <w:t>and</w:t>
+      </w:r>
+      <w:r>
+        <w:t xml:space="preserve"> </w:t>
+      </w:r>
+      <w:r>
+        <w:rPr>
+          <w:b w:val="0"/>
+          <w:i w:val="0"/>
+        </w:rPr>
+        <w:t>ready</w:t>
+      </w:r>
+      <w:r>
+        <w:t xml:space="preserve"> </w:t>
+      </w:r>
+      <w:r>
+        <w:rPr>
+          <w:b w:val="0"/>
+          <w:i w:val="0"/>
+        </w:rPr>
+        <w:t>to</w:t>
+      </w:r>
+      <w:r>
+        <w:t xml:space="preserve"> </w:t>
+      </w:r>
+      <w:r>
+        <w:rPr>
+          <w:b w:val="0"/>
+          <w:i w:val="0"/>
+        </w:rPr>
+        <w:t>receive.</w:t>
+      </w:r>
+      <w:r>
+        <w:t xml:space="preserve"> </w:t>
+      </w:r>
+      <w:r>
+        <w:rPr>
+          <w:b w:val="0"/>
+          <w:i w:val="0"/>
+        </w:rPr>
+        <w:t>Its</w:t>
+      </w:r>
+      <w:r>
+        <w:t xml:space="preserve"> </w:t>
+      </w:r>
+      <w:r>
+        <w:rPr>
+          <w:b w:val="0"/>
+          <w:i w:val="0"/>
+        </w:rPr>
+        <w:t>modules</w:t>
+      </w:r>
+      <w:r>
+        <w:t xml:space="preserve"> </w:t>
+      </w:r>
+      <w:r>
+        <w:rPr>
+          <w:b w:val="0"/>
+          <w:i w:val="0"/>
+        </w:rPr>
+        <w:t>appear</w:t>
+      </w:r>
+      <w:r>
+        <w:t xml:space="preserve"> </w:t>
+      </w:r>
+      <w:r>
+        <w:rPr>
+          <w:b w:val="0"/>
+          <w:i w:val="0"/>
+        </w:rPr>
+        <w:t>in</w:t>
+      </w:r>
+      <w:r>
+        <w:t xml:space="preserve"> </w:t>
+      </w:r>
+      <w:r>
+        <w:rPr>
+          <w:b w:val="0"/>
+          <w:i w:val="0"/>
+        </w:rPr>
+        <w:t>this</w:t>
+      </w:r>
+      <w:r>
+        <w:t xml:space="preserve"> </w:t>
+      </w:r>
+      <w:r>
+        <w:rPr>
+          <w:b w:val="0"/>
+          <w:i w:val="0"/>
+        </w:rPr>
+        <w:t>order:</w:t>
+      </w:r>
+      <w:r>
+        <w:t xml:space="preserve"> </w:t>
+      </w:r>
+      <w:r>
+        <w:rPr>
+          <w:b w:val="0"/>
+          <w:i w:val="0"/>
+        </w:rPr>
+        <w:t>EDIT,</w:t>
+      </w:r>
+      <w:r>
+        <w:t xml:space="preserve"> </w:t>
+      </w:r>
+      <w:r>
+        <w:rPr>
+          <w:b w:val="0"/>
+          <w:i w:val="0"/>
+        </w:rPr>
+        <w:t>STYLE</w:t>
+      </w:r>
+      <w:r>
+        <w:t xml:space="preserve"> </w:t>
+      </w:r>
+      <w:r>
+        <w:rPr>
+          <w:b w:val="0"/>
+          <w:i w:val="0"/>
+        </w:rPr>
+        <w:t>LOG,</w:t>
+      </w:r>
+      <w:r>
+        <w:t xml:space="preserve"> </w:t>
+      </w:r>
+      <w:r>
+        <w:rPr>
+          <w:b w:val="0"/>
+          <w:i w:val="0"/>
+        </w:rPr>
+        <w:t>REFERENCES,</w:t>
+      </w:r>
+      <w:r>
+        <w:t xml:space="preserve"> </w:t>
+      </w:r>
+      <w:r>
+        <w:rPr>
+          <w:b w:val="0"/>
+          <w:i w:val="0"/>
+        </w:rPr>
+        <w:t>then</w:t>
+      </w:r>
+      <w:r>
+        <w:t xml:space="preserve"> </w:t>
+      </w:r>
+      <w:r>
+        <w:rPr>
+          <w:b w:val="0"/>
+          <w:i w:val="0"/>
+        </w:rPr>
+        <w:t>UNRESOLVED</w:t>
+      </w:r>
+      <w:r>
+        <w:t xml:space="preserve"> </w:t>
+      </w:r>
+      <w:r>
+        <w:rPr>
+          <w:b w:val="0"/>
+          <w:i w:val="0"/>
+        </w:rPr>
+        <w:t>only</w:t>
+      </w:r>
+      <w:r>
+        <w:t xml:space="preserve"> </w:t>
+      </w:r>
+      <w:r>
+        <w:rPr>
+          <w:b w:val="0"/>
+          <w:i w:val="0"/>
+        </w:rPr>
+        <w:t>when</w:t>
+      </w:r>
+      <w:r>
+        <w:t xml:space="preserve"> </w:t>
+      </w:r>
+      <w:r>
+        <w:rPr>
+          <w:b w:val="0"/>
+          <w:i w:val="0"/>
+        </w:rPr>
+        <w:t>follow-up</w:t>
+      </w:r>
+      <w:r>
+        <w:t xml:space="preserve"> </w:t>
+      </w:r>
+      <w:r>
+        <w:rPr>
+          <w:b w:val="0"/>
+          <w:i w:val="0"/>
+        </w:rPr>
+        <w:t>is</w:t>
+      </w:r>
+      <w:r>
+        <w:t xml:space="preserve"> </w:t>
+      </w:r>
+      <w:r>
+        <w:rPr>
+          <w:b w:val="0"/>
+          <w:i w:val="0"/>
+        </w:rPr>
+        <w:t>required.</w:t>
+      </w:r>
+    </w:p>
+    <w:p>
+      <w:pPr/>
+      <w:r>
+        <w:rPr>
+          <w:b w:val="0"/>
+          <w:i w:val="0"/>
+        </w:rPr>
+        <w:t>Omit</w:t>
+      </w:r>
+      <w:r>
+        <w:t xml:space="preserve"> </w:t>
+      </w:r>
+      <w:r>
+        <w:rPr>
+          <w:b w:val="0"/>
+          <w:i w:val="0"/>
+        </w:rPr>
+        <w:t>defaults,</w:t>
+      </w:r>
+      <w:r>
+        <w:t xml:space="preserve"> </w:t>
+      </w:r>
+      <w:r>
+        <w:rPr>
+          <w:b w:val="0"/>
+          <w:i w:val="0"/>
+        </w:rPr>
+        <w:t>unused</w:t>
+      </w:r>
+      <w:r>
+        <w:t xml:space="preserve"> </w:t>
+      </w:r>
+      <w:r>
+        <w:rPr>
+          <w:b w:val="0"/>
+          <w:i w:val="0"/>
+        </w:rPr>
+        <w:t>modules</w:t>
+      </w:r>
+      <w:r>
+        <w:t xml:space="preserve"> </w:t>
+      </w:r>
+      <w:r>
+        <w:rPr>
+          <w:b w:val="0"/>
+          <w:i w:val="0"/>
+        </w:rPr>
+        <w:t>and</w:t>
+      </w:r>
+      <w:r>
+        <w:t xml:space="preserve"> </w:t>
+      </w:r>
+      <w:r>
+        <w:rPr>
+          <w:b w:val="0"/>
+          <w:i w:val="0"/>
+        </w:rPr>
+        <w:t>null</w:t>
+      </w:r>
+      <w:r>
+        <w:t xml:space="preserve"> </w:t>
+      </w:r>
+      <w:r>
+        <w:rPr>
+          <w:b w:val="0"/>
+          <w:i w:val="0"/>
+        </w:rPr>
+        <w:t>declarations.</w:t>
+      </w:r>
+      <w:r>
+        <w:t xml:space="preserve"> </w:t>
+      </w:r>
+      <w:r>
+        <w:rPr>
+          <w:b w:val="0"/>
+          <w:i w:val="0"/>
+        </w:rPr>
+        <w:t>Do</w:t>
+      </w:r>
+      <w:r>
+        <w:t xml:space="preserve"> </w:t>
+      </w:r>
+      <w:r>
+        <w:rPr>
+          <w:b w:val="0"/>
+          <w:i w:val="0"/>
+        </w:rPr>
+        <w:t>not</w:t>
+      </w:r>
+      <w:r>
+        <w:t xml:space="preserve"> </w:t>
+      </w:r>
+      <w:r>
+        <w:rPr>
+          <w:b w:val="0"/>
+          <w:i w:val="0"/>
+        </w:rPr>
+        <w:t>write</w:t>
+      </w:r>
+      <w:r>
+        <w:t xml:space="preserve"> </w:t>
+      </w:r>
+      <w:r>
+        <w:rPr>
+          <w:rFonts w:ascii="Courier New" w:hAnsi="Courier New" w:eastAsia="Courier New"/>
+          <w:b w:val="0"/>
+          <w:i w:val="0"/>
+          <w:sz w:val="19"/>
+        </w:rPr>
+        <w:t>none</w:t>
+      </w:r>
+      <w:r>
+        <w:rPr>
+          <w:b w:val="0"/>
+          <w:i w:val="0"/>
+        </w:rPr>
+        <w:t>,</w:t>
+      </w:r>
+      <w:r>
+        <w:t xml:space="preserve"> </w:t>
+      </w:r>
+      <w:r>
+        <w:rPr>
+          <w:rFonts w:ascii="Courier New" w:hAnsi="Courier New" w:eastAsia="Courier New"/>
+          <w:b w:val="0"/>
+          <w:i w:val="0"/>
+          <w:sz w:val="19"/>
+        </w:rPr>
+        <w:t>not triggered</w:t>
+      </w:r>
+      <w:r>
+        <w:rPr>
+          <w:b w:val="0"/>
+          <w:i w:val="0"/>
+        </w:rPr>
+        <w:t>,</w:t>
+      </w:r>
+      <w:r>
+        <w:t xml:space="preserve"> </w:t>
+      </w:r>
+      <w:r>
+        <w:rPr>
+          <w:rFonts w:ascii="Courier New" w:hAnsi="Courier New" w:eastAsia="Courier New"/>
+          <w:b w:val="0"/>
+          <w:i w:val="0"/>
+          <w:sz w:val="19"/>
+        </w:rPr>
+        <w:t>no footprint given</w:t>
+      </w:r>
+      <w:r>
+        <w:t xml:space="preserve"> </w:t>
+      </w:r>
+      <w:r>
+        <w:rPr>
+          <w:b w:val="0"/>
+          <w:i w:val="0"/>
+        </w:rPr>
+        <w:t>or</w:t>
+      </w:r>
+      <w:r>
+        <w:t xml:space="preserve"> </w:t>
+      </w:r>
+      <w:r>
+        <w:rPr>
+          <w:b w:val="0"/>
+          <w:i w:val="0"/>
+        </w:rPr>
+        <w:t>equivalent.</w:t>
+      </w:r>
+      <w:r>
+        <w:t xml:space="preserve"> </w:t>
+      </w:r>
+      <w:r>
+        <w:rPr>
+          <w:b w:val="0"/>
+          <w:i w:val="0"/>
+        </w:rPr>
+        <w:t>Absence</w:t>
+      </w:r>
+      <w:r>
+        <w:t xml:space="preserve"> </w:t>
+      </w:r>
+      <w:r>
+        <w:rPr>
+          <w:b w:val="0"/>
+          <w:i w:val="0"/>
+        </w:rPr>
+        <w:t>means</w:t>
+      </w:r>
+      <w:r>
+        <w:t xml:space="preserve"> </w:t>
+      </w:r>
+      <w:r>
+        <w:rPr>
+          <w:b w:val="0"/>
+          <w:i w:val="0"/>
+        </w:rPr>
+        <w:t>the</w:t>
+      </w:r>
+      <w:r>
+        <w:t xml:space="preserve"> </w:t>
+      </w:r>
+      <w:r>
+        <w:rPr>
+          <w:b w:val="0"/>
+          <w:i w:val="0"/>
+        </w:rPr>
+        <w:t>default</w:t>
+      </w:r>
+      <w:r>
+        <w:t xml:space="preserve"> </w:t>
+      </w:r>
+      <w:r>
+        <w:rPr>
+          <w:b w:val="0"/>
+          <w:i w:val="0"/>
+        </w:rPr>
+        <w:t>applied</w:t>
+      </w:r>
+      <w:r>
+        <w:t xml:space="preserve"> </w:t>
+      </w:r>
+      <w:r>
+        <w:rPr>
+          <w:b w:val="0"/>
+          <w:i w:val="0"/>
+        </w:rPr>
+        <w:t>or</w:t>
+      </w:r>
+      <w:r>
+        <w:t xml:space="preserve"> </w:t>
+      </w:r>
+      <w:r>
+        <w:rPr>
+          <w:b w:val="0"/>
+          <w:i w:val="0"/>
+        </w:rPr>
+        <w:t>the</w:t>
+      </w:r>
+      <w:r>
+        <w:t xml:space="preserve"> </w:t>
+      </w:r>
+      <w:r>
+        <w:rPr>
+          <w:b w:val="0"/>
+          <w:i w:val="0"/>
+        </w:rPr>
+        <w:t>conditional</w:t>
+      </w:r>
+      <w:r>
+        <w:t xml:space="preserve"> </w:t>
+      </w:r>
+      <w:r>
+        <w:rPr>
+          <w:b w:val="0"/>
+          <w:i w:val="0"/>
+        </w:rPr>
+        <w:t>module</w:t>
+      </w:r>
+      <w:r>
+        <w:t xml:space="preserve"> </w:t>
+      </w:r>
+      <w:r>
+        <w:rPr>
+          <w:b w:val="0"/>
+          <w:i w:val="0"/>
+        </w:rPr>
+        <w:t>was</w:t>
+      </w:r>
+      <w:r>
+        <w:t xml:space="preserve"> </w:t>
+      </w:r>
+      <w:r>
+        <w:rPr>
+          <w:b w:val="0"/>
+          <w:i w:val="0"/>
+        </w:rPr>
+        <w:t>not</w:t>
+      </w:r>
+      <w:r>
+        <w:t xml:space="preserve"> </w:t>
+      </w:r>
+      <w:r>
+        <w:rPr>
+          <w:b w:val="0"/>
+          <w:i w:val="0"/>
+        </w:rPr>
+        <w:t>used.</w:t>
+      </w:r>
+    </w:p>
+    <w:p>
+      <w:bookmarkStart w:id="9019" w:name="_bkp_toc_19"/>
+      <w:pPr>
+        <w:pStyle w:val="Heading3"/>
+      </w:pPr>
+      <w:r>
+        <w:rPr>
+          <w:b w:val="0"/>
+          <w:i w:val="0"/>
+        </w:rPr>
         <w:t>FORMAT</w:t>
       </w:r>
+      <w:bookmarkEnd w:id="9019"/>
     </w:p>
     <w:p>
       <w:pPr>
@@ -23190,6 +24609,32 @@
         </w:pBdr>
       </w:pPr>
       <w:r>
+        <w:t>JOB REPORT</w:t>
+      </w:r>
+      <w:r>
+        <w:br/>
+      </w:r>
+      <w:r>
+        <w:t>ID: [slug-as-filed]</w:t>
+      </w:r>
+      <w:r>
+        <w:br/>
+      </w:r>
+      <w:r/>
+      <w:r>
+        <w:br/>
+      </w:r>
+      <w:r>
+        <w:t>EDIT</w:t>
+      </w:r>
+      <w:r>
+        <w:br/>
+      </w:r>
+      <w:r/>
+      <w:r>
+        <w:br/>
+      </w:r>
+      <w:r>
         <w:t>[Hold/Query/Anomaly — if needed]</w:t>
       </w:r>
       <w:r>
@@ -23200,7 +24645,7 @@
         <w:br/>
       </w:r>
       <w:r>
-        <w:t>[Slug]</w:t>
+        <w:t>[THE BOX — FENCED CODE BLOCK + COPY BUTTON]</w:t>
       </w:r>
       <w:r>
         <w:br/>
@@ -23210,7 +24655,7 @@
         <w:br/>
       </w:r>
       <w:r>
-        <w:t>[THE BOX — FENCED CODE BLOCK + COPY BUTTON]</w:t>
+        <w:t>&lt;page_ready&gt;</w:t>
       </w:r>
       <w:r>
         <w:br/>
@@ -23220,29 +24665,39 @@
         <w:br/>
       </w:r>
       <w:r>
-        <w:t>&lt;page_ready&gt;</w:t>
+        <w:t>```text</w:t>
       </w:r>
       <w:r>
         <w:br/>
       </w:r>
+      <w:r>
+        <w:t>[First-choice headline in sentence case]</w:t>
+      </w:r>
+      <w:r>
+        <w:br/>
+      </w:r>
+      <w:r>
+        <w:t>[First-choice deck]</w:t>
+      </w:r>
+      <w:r>
+        <w:br/>
+      </w:r>
       <w:r/>
       <w:r>
         <w:br/>
       </w:r>
-      <w:r>
-        <w:t>```text</w:t>
-      </w:r>
+      <w:r/>
       <w:r>
         <w:br/>
       </w:r>
       <w:r>
-        <w:t>[First-choice headline in sentence case]</w:t>
+        <w:t>[Full clean body copy]</w:t>
       </w:r>
       <w:r>
         <w:br/>
       </w:r>
       <w:r>
-        <w:t>[First-choice deck]</w:t>
+        <w:t>```</w:t>
       </w:r>
       <w:r>
         <w:br/>
@@ -23251,50 +24706,72 @@
       <w:r>
         <w:br/>
       </w:r>
+      <w:r>
+        <w:t>&lt;/page_ready&gt;</w:t>
+      </w:r>
+      <w:r>
+        <w:br/>
+      </w:r>
       <w:r/>
       <w:r>
         <w:br/>
       </w:r>
       <w:r>
-        <w:t>[Full clean body copy]</w:t>
+        <w:t>[ALTERNATES]</w:t>
       </w:r>
       <w:r>
         <w:br/>
       </w:r>
-      <w:r>
-        <w:t>```</w:t>
-      </w:r>
+      <w:r/>
       <w:r>
         <w:br/>
       </w:r>
+      <w:r>
+        <w:t>STYLE LOG</w:t>
+      </w:r>
+      <w:r>
+        <w:br/>
+      </w:r>
+      <w:r>
+        <w:t>[actual interventions only]</w:t>
+      </w:r>
+      <w:r>
+        <w:br/>
+      </w:r>
       <w:r/>
       <w:r>
         <w:br/>
       </w:r>
       <w:r>
-        <w:t>&lt;/page_ready&gt;</w:t>
+        <w:t>REFERENCES</w:t>
       </w:r>
       <w:r>
         <w:br/>
       </w:r>
+      <w:r>
+        <w:t>[edition | applicable GUIDE chapter paths]</w:t>
+      </w:r>
+      <w:r>
+        <w:br/>
+      </w:r>
+      <w:r>
+        <w:t>[DIRECTORYQ — only if internal lookups were triggered]</w:t>
+      </w:r>
+      <w:r>
+        <w:br/>
+      </w:r>
+      <w:r>
+        <w:t>[SEARCHQ — only if external searches were executed]</w:t>
+      </w:r>
+      <w:r>
+        <w:br/>
+      </w:r>
       <w:r/>
       <w:r>
         <w:br/>
       </w:r>
       <w:r>
-        <w:t>[ALTERNATES]</w:t>
-      </w:r>
-      <w:r>
-        <w:br/>
-      </w:r>
-      <w:r>
-        <w:t>[STYLE LOG]</w:t>
-      </w:r>
-      <w:r>
-        <w:br/>
-      </w:r>
-      <w:r>
-        <w:t>[STATE LOG]</w:t>
+        <w:t>[UNRESOLVED — only if follow-up is required]</w:t>
       </w:r>
     </w:p>
     <w:p>
@@ -23470,7 +24947,7 @@
           <w:b/>
           <w:i w:val="0"/>
         </w:rPr>
-        <w:t>thing</w:t>
+        <w:t>edit</w:t>
       </w:r>
       <w:r>
         <w:t xml:space="preserve"> </w:t>
@@ -23722,6 +25199,16 @@
           <w:b w:val="0"/>
           <w:i w:val="0"/>
         </w:rPr>
+        <w:t>and</w:t>
+      </w:r>
+      <w:r>
+        <w:t xml:space="preserve"> </w:t>
+      </w:r>
+      <w:r>
+        <w:rPr>
+          <w:b w:val="0"/>
+          <w:i w:val="0"/>
+        </w:rPr>
         <w:t>the</w:t>
       </w:r>
       <w:r>
@@ -23762,7 +25249,27 @@
           <w:b w:val="0"/>
           <w:i w:val="0"/>
         </w:rPr>
-        <w:t>above</w:t>
+        <w:t>inside</w:t>
+      </w:r>
+      <w:r>
+        <w:t xml:space="preserve"> </w:t>
+      </w:r>
+      <w:r>
+        <w:rPr>
+          <w:b w:val="0"/>
+          <w:i w:val="0"/>
+        </w:rPr>
+        <w:t>EDIT</w:t>
+      </w:r>
+      <w:r>
+        <w:t xml:space="preserve"> </w:t>
+      </w:r>
+      <w:r>
+        <w:rPr>
+          <w:b w:val="0"/>
+          <w:i w:val="0"/>
+        </w:rPr>
+        <w:t>before</w:t>
       </w:r>
       <w:r>
         <w:t xml:space="preserve"> </w:t>
@@ -23782,7 +25289,7 @@
           <w:b w:val="0"/>
           <w:i w:val="0"/>
         </w:rPr>
-        <w:t>slug</w:t>
+        <w:t>box</w:t>
       </w:r>
       <w:r>
         <w:t xml:space="preserve"> </w:t>
@@ -24516,6 +26023,7 @@
       </w:r>
     </w:p>
     <w:p>
+      <w:bookmarkStart w:id="9020" w:name="_bkp_toc_20"/>
       <w:pPr>
         <w:pStyle w:val="Heading3"/>
       </w:pPr>
@@ -24536,61 +26044,26 @@
         </w:rPr>
         <w:t>LOG</w:t>
       </w:r>
-    </w:p>
-    <w:p>
-      <w:pPr>
-        <w:pStyle w:val="BKPAxiomLabel"/>
-        <w:pBdr>
-          <w:left w:val="single" w:sz="28" w:space="9" w:color="000000"/>
-        </w:pBdr>
-      </w:pPr>
-      <w:r>
-        <w:t>AXIOM</w:t>
-      </w:r>
-    </w:p>
-    <w:p>
-      <w:pPr>
-        <w:pStyle w:val="BKPAxiom"/>
-        <w:pBdr>
-          <w:left w:val="single" w:sz="28" w:space="9" w:color="000000"/>
-        </w:pBdr>
-      </w:pPr>
-      <w:r>
-        <w:rPr>
-          <w:b w:val="0"/>
-          <w:i w:val="0"/>
-        </w:rPr>
-        <w:t>Append</w:t>
-      </w:r>
-      <w:r>
-        <w:t xml:space="preserve"> </w:t>
-      </w:r>
-      <w:r>
-        <w:rPr>
-          <w:b w:val="0"/>
-          <w:i w:val="0"/>
-        </w:rPr>
-        <w:t>after</w:t>
-      </w:r>
-      <w:r>
-        <w:t xml:space="preserve"> </w:t>
-      </w:r>
-      <w:r>
-        <w:rPr>
-          <w:b w:val="0"/>
-          <w:i w:val="0"/>
-        </w:rPr>
-        <w:t>alternates</w:t>
-      </w:r>
-      <w:r>
-        <w:t xml:space="preserve"> </w:t>
-      </w:r>
-      <w:r>
-        <w:rPr>
-          <w:b w:val="0"/>
-          <w:i w:val="0"/>
-        </w:rPr>
-        <w:t>a</w:t>
+      <w:bookmarkEnd w:id="9020"/>
+    </w:p>
+    <w:p>
+      <w:pPr/>
+      <w:r>
+        <w:rPr>
+          <w:b w:val="0"/>
+          <w:i w:val="0"/>
+        </w:rPr>
+        <w:t>After</w:t>
+      </w:r>
+      <w:r>
+        <w:t xml:space="preserve"> </w:t>
+      </w:r>
+      <w:r>
+        <w:rPr>
+          <w:b w:val="0"/>
+          <w:i w:val="0"/>
+        </w:rPr>
+        <w:t>alternates,</w:t>
       </w:r>
       <w:r>
         <w:t xml:space="preserve"> </w:t>
@@ -24610,6 +26083,46 @@
           <w:b w:val="0"/>
           <w:i w:val="0"/>
         </w:rPr>
+        <w:t>actual</w:t>
+      </w:r>
+      <w:r>
+        <w:t xml:space="preserve"> </w:t>
+      </w:r>
+      <w:r>
+        <w:rPr>
+          <w:b w:val="0"/>
+          <w:i w:val="0"/>
+        </w:rPr>
+        <w:t>interventions,</w:t>
+      </w:r>
+      <w:r>
+        <w:t xml:space="preserve"> </w:t>
+      </w:r>
+      <w:r>
+        <w:rPr>
+          <w:b w:val="0"/>
+          <w:i w:val="0"/>
+        </w:rPr>
+        <w:t>not</w:t>
+      </w:r>
+      <w:r>
+        <w:t xml:space="preserve"> </w:t>
+      </w:r>
+      <w:r>
+        <w:rPr>
+          <w:b w:val="0"/>
+          <w:i w:val="0"/>
+        </w:rPr>
+        <w:t>confirmation</w:t>
+      </w:r>
+      <w:r>
+        <w:t xml:space="preserve"> </w:t>
+      </w:r>
+      <w:r>
+        <w:rPr>
+          <w:b w:val="0"/>
+          <w:i w:val="0"/>
+        </w:rPr>
         <w:t>of</w:t>
       </w:r>
       <w:r>
@@ -24620,77 +26133,21 @@
           <w:b w:val="0"/>
           <w:i w:val="0"/>
         </w:rPr>
-        <w:t>work</w:t>
-      </w:r>
-      <w:r>
-        <w:t xml:space="preserve"> </w:t>
-      </w:r>
-      <w:r>
-        <w:rPr>
-          <w:b w:val="0"/>
-          <w:i w:val="0"/>
-        </w:rPr>
-        <w:t>done,</w:t>
-      </w:r>
-      <w:r>
-        <w:t xml:space="preserve"> </w:t>
-      </w:r>
-      <w:r>
-        <w:rPr>
-          <w:b w:val="0"/>
-          <w:i w:val="0"/>
-        </w:rPr>
-        <w:t>not</w:t>
-      </w:r>
-      <w:r>
-        <w:t xml:space="preserve"> </w:t>
-      </w:r>
-      <w:r>
-        <w:rPr>
-          <w:b w:val="0"/>
-          <w:i w:val="0"/>
-        </w:rPr>
-        <w:t>confirmation</w:t>
-      </w:r>
-      <w:r>
-        <w:t xml:space="preserve"> </w:t>
-      </w:r>
-      <w:r>
-        <w:rPr>
-          <w:b w:val="0"/>
-          <w:i w:val="0"/>
-        </w:rPr>
-        <w:t>of</w:t>
-      </w:r>
-      <w:r>
-        <w:t xml:space="preserve"> </w:t>
-      </w:r>
-      <w:r>
-        <w:rPr>
-          <w:b w:val="0"/>
-          <w:i w:val="0"/>
-        </w:rPr>
         <w:t>correctness.</w:t>
       </w:r>
-    </w:p>
-    <w:p>
-      <w:pPr/>
-      <w:r>
-        <w:rPr>
-          <w:b w:val="0"/>
-          <w:i w:val="0"/>
-        </w:rPr>
-        <w:t>Include:</w:t>
-      </w:r>
-    </w:p>
-    <w:p>
-      <w:pPr>
-        <w:pStyle w:val="BKPBullet"/>
-        <w:numPr>
-          <w:ilvl w:val="0"/>
-          <w:numId w:val="6"/>
-        </w:numPr>
-      </w:pPr>
+      <w:r>
+        <w:t xml:space="preserve"> </w:t>
+      </w:r>
+      <w:r>
+        <w:rPr>
+          <w:b w:val="0"/>
+          <w:i w:val="0"/>
+        </w:rPr>
+        <w:t>Include</w:t>
+      </w:r>
+      <w:r>
+        <w:t xml:space="preserve"> </w:t>
+      </w:r>
       <w:r>
         <w:rPr>
           <w:b w:val="0"/>
@@ -24706,27 +26163,11 @@
           <w:b w:val="0"/>
           <w:i w:val="0"/>
         </w:rPr>
-        <w:t>changes</w:t>
-      </w:r>
-      <w:r>
-        <w:t xml:space="preserve"> </w:t>
-      </w:r>
-      <w:r>
-        <w:rPr>
-          <w:b w:val="0"/>
-          <w:i w:val="0"/>
-        </w:rPr>
-        <w:t>made;</w:t>
-      </w:r>
-    </w:p>
-    <w:p>
-      <w:pPr>
-        <w:pStyle w:val="BKPBullet"/>
-        <w:numPr>
-          <w:ilvl w:val="0"/>
-          <w:numId w:val="6"/>
-        </w:numPr>
-      </w:pPr>
+        <w:t>changes;</w:t>
+      </w:r>
+      <w:r>
+        <w:t xml:space="preserve"> </w:t>
+      </w:r>
       <w:r>
         <w:rPr>
           <w:b w:val="0"/>
@@ -24754,15 +26195,9 @@
         </w:rPr>
         <w:t>10%;</w:t>
       </w:r>
-    </w:p>
-    <w:p>
-      <w:pPr>
-        <w:pStyle w:val="BKPBullet"/>
-        <w:numPr>
-          <w:ilvl w:val="0"/>
-          <w:numId w:val="6"/>
-        </w:numPr>
-      </w:pPr>
+      <w:r>
+        <w:t xml:space="preserve"> </w:t>
+      </w:r>
       <w:r>
         <w:rPr>
           <w:b w:val="0"/>
@@ -24778,7 +26213,7 @@
           <w:b w:val="0"/>
           <w:i w:val="0"/>
         </w:rPr>
-        <w:t>content,</w:t>
+        <w:t>content</w:t>
       </w:r>
       <w:r>
         <w:t xml:space="preserve"> </w:t>
@@ -24810,15 +26245,9 @@
         </w:rPr>
         <w:t>sentence;</w:t>
       </w:r>
-    </w:p>
-    <w:p>
-      <w:pPr>
-        <w:pStyle w:val="BKPBullet"/>
-        <w:numPr>
-          <w:ilvl w:val="0"/>
-          <w:numId w:val="6"/>
-        </w:numPr>
-      </w:pPr>
+      <w:r>
+        <w:t xml:space="preserve"> </w:t>
+      </w:r>
       <w:r>
         <w:rPr>
           <w:b w:val="0"/>
@@ -24834,47 +26263,47 @@
           <w:b w:val="0"/>
           <w:i w:val="0"/>
         </w:rPr>
-        <w:t>swaps</w:t>
-      </w:r>
-      <w:r>
-        <w:t xml:space="preserve"> </w:t>
-      </w:r>
-      <w:r>
-        <w:rPr>
-          <w:b w:val="0"/>
-          <w:i w:val="0"/>
-        </w:rPr>
-        <w:t>—</w:t>
-      </w:r>
-      <w:r>
-        <w:t xml:space="preserve"> </w:t>
-      </w:r>
-      <w:r>
-        <w:rPr>
-          <w:b w:val="0"/>
-          <w:i w:val="0"/>
-        </w:rPr>
-        <w:t>what</w:t>
-      </w:r>
-      <w:r>
-        <w:t xml:space="preserve"> </w:t>
-      </w:r>
-      <w:r>
-        <w:rPr>
-          <w:b w:val="0"/>
-          <w:i w:val="0"/>
-        </w:rPr>
-        <w:t>was</w:t>
-      </w:r>
-      <w:r>
-        <w:t xml:space="preserve"> </w:t>
-      </w:r>
-      <w:r>
-        <w:rPr>
-          <w:b w:val="0"/>
-          <w:i w:val="0"/>
-        </w:rPr>
-        <w:t>added</w:t>
+        <w:t>swaps;</w:t>
+      </w:r>
+      <w:r>
+        <w:t xml:space="preserve"> </w:t>
+      </w:r>
+      <w:r>
+        <w:rPr>
+          <w:b w:val="0"/>
+          <w:i w:val="0"/>
+        </w:rPr>
+        <w:t>timeline</w:t>
+      </w:r>
+      <w:r>
+        <w:t xml:space="preserve"> </w:t>
+      </w:r>
+      <w:r>
+        <w:rPr>
+          <w:b w:val="0"/>
+          <w:i w:val="0"/>
+        </w:rPr>
+        <w:t>corrections;</w:t>
+      </w:r>
+      <w:r>
+        <w:t xml:space="preserve"> </w:t>
+      </w:r>
+      <w:r>
+        <w:rPr>
+          <w:b w:val="0"/>
+          <w:i w:val="0"/>
+        </w:rPr>
+        <w:t>legal</w:t>
+      </w:r>
+      <w:r>
+        <w:t xml:space="preserve"> </w:t>
+      </w:r>
+      <w:r>
+        <w:rPr>
+          <w:b w:val="0"/>
+          <w:i w:val="0"/>
+        </w:rPr>
+        <w:t>flags;</w:t>
       </w:r>
       <w:r>
         <w:t xml:space="preserve"> </w:t>
@@ -24894,42 +26323,6 @@
           <w:b w:val="0"/>
           <w:i w:val="0"/>
         </w:rPr>
-        <w:t>what</w:t>
-      </w:r>
-      <w:r>
-        <w:t xml:space="preserve"> </w:t>
-      </w:r>
-      <w:r>
-        <w:rPr>
-          <w:b w:val="0"/>
-          <w:i w:val="0"/>
-        </w:rPr>
-        <w:t>was</w:t>
-      </w:r>
-      <w:r>
-        <w:t xml:space="preserve"> </w:t>
-      </w:r>
-      <w:r>
-        <w:rPr>
-          <w:b w:val="0"/>
-          <w:i w:val="0"/>
-        </w:rPr>
-        <w:t>cut;</w:t>
-      </w:r>
-    </w:p>
-    <w:p>
-      <w:pPr>
-        <w:pStyle w:val="BKPBullet"/>
-        <w:numPr>
-          <w:ilvl w:val="0"/>
-          <w:numId w:val="6"/>
-        </w:numPr>
-      </w:pPr>
-      <w:r>
-        <w:rPr>
-          <w:b w:val="0"/>
-          <w:i w:val="0"/>
-        </w:rPr>
         <w:t>unresolved</w:t>
       </w:r>
       <w:r>
@@ -24950,145 +26343,67 @@
           <w:b w:val="0"/>
           <w:i w:val="0"/>
         </w:rPr>
-        <w:t>issues;</w:t>
-      </w:r>
-    </w:p>
-    <w:p>
-      <w:pPr>
-        <w:pStyle w:val="BKPBullet"/>
-        <w:numPr>
-          <w:ilvl w:val="0"/>
-          <w:numId w:val="6"/>
-        </w:numPr>
-      </w:pPr>
-      <w:r>
-        <w:rPr>
-          <w:b w:val="0"/>
-          <w:i w:val="0"/>
-        </w:rPr>
-        <w:t>timeline</w:t>
-      </w:r>
-      <w:r>
-        <w:t xml:space="preserve"> </w:t>
-      </w:r>
-      <w:r>
-        <w:rPr>
-          <w:b w:val="0"/>
-          <w:i w:val="0"/>
-        </w:rPr>
-        <w:t>corrections;</w:t>
-      </w:r>
-    </w:p>
-    <w:p>
-      <w:pPr>
-        <w:pStyle w:val="BKPBullet"/>
-        <w:numPr>
-          <w:ilvl w:val="0"/>
-          <w:numId w:val="6"/>
-        </w:numPr>
-      </w:pPr>
-      <w:r>
-        <w:rPr>
-          <w:b w:val="0"/>
-          <w:i w:val="0"/>
-        </w:rPr>
-        <w:t>legal</w:t>
-      </w:r>
-      <w:r>
-        <w:t xml:space="preserve"> </w:t>
-      </w:r>
-      <w:r>
-        <w:rPr>
-          <w:b w:val="0"/>
-          <w:i w:val="0"/>
-        </w:rPr>
-        <w:t>flags;</w:t>
-      </w:r>
-    </w:p>
-    <w:p>
-      <w:pPr>
-        <w:pStyle w:val="BKPBullet"/>
-        <w:numPr>
-          <w:ilvl w:val="0"/>
-          <w:numId w:val="6"/>
-        </w:numPr>
-      </w:pPr>
-      <w:r>
-        <w:rPr>
-          <w:b w:val="0"/>
-          <w:i w:val="0"/>
-        </w:rPr>
-        <w:t>SEARCHQ</w:t>
-      </w:r>
-      <w:r>
-        <w:t xml:space="preserve"> </w:t>
-      </w:r>
-      <w:r>
-        <w:rPr>
-          <w:b w:val="0"/>
-          <w:i w:val="0"/>
-        </w:rPr>
-        <w:t>audit</w:t>
-      </w:r>
-      <w:r>
-        <w:t xml:space="preserve"> </w:t>
-      </w:r>
-      <w:r>
-        <w:rPr>
-          <w:b w:val="0"/>
-          <w:i w:val="0"/>
-        </w:rPr>
-        <w:t>block</w:t>
-      </w:r>
-      <w:r>
-        <w:t xml:space="preserve"> </w:t>
-      </w:r>
-      <w:r>
-        <w:rPr>
-          <w:b w:val="0"/>
-          <w:i w:val="0"/>
-        </w:rPr>
-        <w:t>(if</w:t>
-      </w:r>
-      <w:r>
-        <w:t xml:space="preserve"> </w:t>
-      </w:r>
-      <w:r>
-        <w:rPr>
-          <w:b w:val="0"/>
-          <w:i w:val="0"/>
-        </w:rPr>
-        <w:t>external</w:t>
-      </w:r>
-      <w:r>
-        <w:t xml:space="preserve"> </w:t>
-      </w:r>
-      <w:r>
-        <w:rPr>
-          <w:b w:val="0"/>
-          <w:i w:val="0"/>
-        </w:rPr>
-        <w:t>searches</w:t>
-      </w:r>
-      <w:r>
-        <w:t xml:space="preserve"> </w:t>
-      </w:r>
-      <w:r>
-        <w:rPr>
-          <w:b w:val="0"/>
-          <w:i w:val="0"/>
-        </w:rPr>
-        <w:t>were</w:t>
-      </w:r>
-      <w:r>
-        <w:t xml:space="preserve"> </w:t>
-      </w:r>
-      <w:r>
-        <w:rPr>
-          <w:b w:val="0"/>
-          <w:i w:val="0"/>
-        </w:rPr>
-        <w:t>executed).</w:t>
+        <w:t>issues.</w:t>
+      </w:r>
+      <w:r>
+        <w:t xml:space="preserve"> </w:t>
+      </w:r>
+      <w:r>
+        <w:rPr>
+          <w:b w:val="0"/>
+          <w:i w:val="0"/>
+        </w:rPr>
+        <w:t>Omit</w:t>
+      </w:r>
+      <w:r>
+        <w:t xml:space="preserve"> </w:t>
+      </w:r>
+      <w:r>
+        <w:rPr>
+          <w:b w:val="0"/>
+          <w:i w:val="0"/>
+        </w:rPr>
+        <w:t>confirmed-correct</w:t>
+      </w:r>
+      <w:r>
+        <w:t xml:space="preserve"> </w:t>
+      </w:r>
+      <w:r>
+        <w:rPr>
+          <w:b w:val="0"/>
+          <w:i w:val="0"/>
+        </w:rPr>
+        <w:t>material</w:t>
+      </w:r>
+      <w:r>
+        <w:t xml:space="preserve"> </w:t>
+      </w:r>
+      <w:r>
+        <w:rPr>
+          <w:b w:val="0"/>
+          <w:i w:val="0"/>
+        </w:rPr>
+        <w:t>and</w:t>
+      </w:r>
+      <w:r>
+        <w:t xml:space="preserve"> </w:t>
+      </w:r>
+      <w:r>
+        <w:rPr>
+          <w:b w:val="0"/>
+          <w:i w:val="0"/>
+        </w:rPr>
+        <w:t>null</w:t>
+      </w:r>
+      <w:r>
+        <w:t xml:space="preserve"> </w:t>
+      </w:r>
+      <w:r>
+        <w:rPr>
+          <w:b w:val="0"/>
+          <w:i w:val="0"/>
+        </w:rPr>
+        <w:t>declarations.</w:t>
       </w:r>
     </w:p>
     <w:p>
@@ -25156,7 +26471,7 @@
         <w:br/>
       </w:r>
       <w:r>
-        <w:t>Niger | Demonym corrected to Nigerien per REFERENCES.</w:t>
+        <w:t>Niger | Demonym corrected to Nigerien per DIRECTORY.</w:t>
       </w:r>
       <w:r>
         <w:br/>
@@ -25170,6 +26485,7 @@
       </w:r>
     </w:p>
     <w:p>
+      <w:bookmarkStart w:id="9021" w:name="_bkp_toc_21"/>
       <w:pPr>
         <w:pStyle w:val="Heading3"/>
       </w:pPr>
@@ -25178,94 +26494,9 @@
           <w:b w:val="0"/>
           <w:i w:val="0"/>
         </w:rPr>
-        <w:t>STATE</w:t>
-      </w:r>
-      <w:r>
-        <w:t xml:space="preserve"> </w:t>
-      </w:r>
-      <w:r>
-        <w:rPr>
-          <w:b w:val="0"/>
-          <w:i w:val="0"/>
-        </w:rPr>
-        <w:t>LOG</w:t>
-      </w:r>
-    </w:p>
-    <w:p>
-      <w:pPr>
-        <w:pStyle w:val="BKPAxiomLabel"/>
-        <w:pBdr>
-          <w:left w:val="single" w:sz="28" w:space="9" w:color="000000"/>
-        </w:pBdr>
-      </w:pPr>
-      <w:r>
-        <w:t>AXIOM</w:t>
-      </w:r>
-    </w:p>
-    <w:p>
-      <w:pPr>
-        <w:pStyle w:val="BKPAxiom"/>
-        <w:pBdr>
-          <w:left w:val="single" w:sz="28" w:space="9" w:color="000000"/>
-        </w:pBdr>
-      </w:pPr>
-      <w:r>
-        <w:rPr>
-          <w:b w:val="0"/>
-          <w:i w:val="0"/>
-        </w:rPr>
-        <w:t>The</w:t>
-      </w:r>
-      <w:r>
-        <w:t xml:space="preserve"> </w:t>
-      </w:r>
-      <w:r>
-        <w:rPr>
-          <w:b w:val="0"/>
-          <w:i w:val="0"/>
-        </w:rPr>
-        <w:t>STATE</w:t>
-      </w:r>
-      <w:r>
-        <w:t xml:space="preserve"> </w:t>
-      </w:r>
-      <w:r>
-        <w:rPr>
-          <w:b w:val="0"/>
-          <w:i w:val="0"/>
-        </w:rPr>
-        <w:t>LOG</w:t>
-      </w:r>
-      <w:r>
-        <w:t xml:space="preserve"> </w:t>
-      </w:r>
-      <w:r>
-        <w:rPr>
-          <w:b w:val="0"/>
-          <w:i w:val="0"/>
-        </w:rPr>
-        <w:t>closes</w:t>
-      </w:r>
-      <w:r>
-        <w:t xml:space="preserve"> </w:t>
-      </w:r>
-      <w:r>
-        <w:rPr>
-          <w:b w:val="0"/>
-          <w:i w:val="0"/>
-        </w:rPr>
-        <w:t>every</w:t>
-      </w:r>
-      <w:r>
-        <w:t xml:space="preserve"> </w:t>
-      </w:r>
-      <w:r>
-        <w:rPr>
-          <w:b w:val="0"/>
-          <w:i w:val="0"/>
-        </w:rPr>
-        <w:t>output.</w:t>
-      </w:r>
+        <w:t>REFERENCES</w:t>
+      </w:r>
+      <w:bookmarkEnd w:id="9021"/>
     </w:p>
     <w:p>
       <w:pPr/>
@@ -25274,135 +26505,287 @@
           <w:b w:val="0"/>
           <w:i w:val="0"/>
         </w:rPr>
-        <w:t>Each</w:t>
-      </w:r>
-      <w:r>
-        <w:t xml:space="preserve"> </w:t>
-      </w:r>
-      <w:r>
-        <w:rPr>
-          <w:b w:val="0"/>
-          <w:i w:val="0"/>
-        </w:rPr>
-        <w:t>field</w:t>
-      </w:r>
-      <w:r>
-        <w:t xml:space="preserve"> </w:t>
-      </w:r>
-      <w:r>
-        <w:rPr>
-          <w:b w:val="0"/>
-          <w:i w:val="0"/>
-        </w:rPr>
-        <w:t>stands</w:t>
-      </w:r>
-      <w:r>
-        <w:t xml:space="preserve"> </w:t>
-      </w:r>
-      <w:r>
-        <w:rPr>
-          <w:b w:val="0"/>
-          <w:i w:val="0"/>
-        </w:rPr>
-        <w:t>alone:</w:t>
-      </w:r>
-    </w:p>
-    <w:p>
-      <w:pPr>
-        <w:pStyle w:val="BKPBullet"/>
-        <w:numPr>
-          <w:ilvl w:val="0"/>
-          <w:numId w:val="6"/>
-        </w:numPr>
-      </w:pPr>
-      <w:r>
-        <w:rPr>
-          <w:b w:val="0"/>
-          <w:i w:val="0"/>
-        </w:rPr>
-        <w:t>pronouns</w:t>
-      </w:r>
-      <w:r>
-        <w:t xml:space="preserve"> </w:t>
-      </w:r>
-      <w:r>
-        <w:rPr>
-          <w:b w:val="0"/>
-          <w:i w:val="0"/>
-        </w:rPr>
-        <w:t>resolved;</w:t>
-      </w:r>
-    </w:p>
-    <w:p>
-      <w:pPr>
-        <w:pStyle w:val="BKPBullet"/>
-        <w:numPr>
-          <w:ilvl w:val="0"/>
-          <w:numId w:val="6"/>
-        </w:numPr>
-      </w:pPr>
-      <w:r>
-        <w:rPr>
-          <w:b w:val="0"/>
-          <w:i w:val="0"/>
-        </w:rPr>
-        <w:t>readable</w:t>
-      </w:r>
-      <w:r>
-        <w:t xml:space="preserve"> </w:t>
-      </w:r>
-      <w:r>
-        <w:rPr>
-          <w:b w:val="0"/>
-          <w:i w:val="0"/>
-        </w:rPr>
-        <w:t>cold;</w:t>
-      </w:r>
-    </w:p>
-    <w:p>
-      <w:pPr>
-        <w:pStyle w:val="BKPBullet"/>
-        <w:numPr>
-          <w:ilvl w:val="0"/>
-          <w:numId w:val="6"/>
-        </w:numPr>
-      </w:pPr>
-      <w:r>
-        <w:rPr>
-          <w:b w:val="0"/>
-          <w:i w:val="0"/>
-        </w:rPr>
-        <w:t>no</w:t>
-      </w:r>
-      <w:r>
-        <w:t xml:space="preserve"> </w:t>
-      </w:r>
-      <w:r>
-        <w:rPr>
-          <w:b w:val="0"/>
-          <w:i w:val="0"/>
-        </w:rPr>
-        <w:t>surrounding</w:t>
-      </w:r>
-      <w:r>
-        <w:t xml:space="preserve"> </w:t>
-      </w:r>
-      <w:r>
-        <w:rPr>
-          <w:b w:val="0"/>
-          <w:i w:val="0"/>
-        </w:rPr>
-        <w:t>thread</w:t>
-      </w:r>
-      <w:r>
-        <w:t xml:space="preserve"> </w:t>
-      </w:r>
-      <w:r>
-        <w:rPr>
-          <w:b w:val="0"/>
-          <w:i w:val="0"/>
-        </w:rPr>
-        <w:t>required.</w:t>
+        <w:t>REFERENCES</w:t>
+      </w:r>
+      <w:r>
+        <w:t xml:space="preserve"> </w:t>
+      </w:r>
+      <w:r>
+        <w:rPr>
+          <w:b w:val="0"/>
+          <w:i w:val="0"/>
+        </w:rPr>
+        <w:t>immediately</w:t>
+      </w:r>
+      <w:r>
+        <w:t xml:space="preserve"> </w:t>
+      </w:r>
+      <w:r>
+        <w:rPr>
+          <w:b w:val="0"/>
+          <w:i w:val="0"/>
+        </w:rPr>
+        <w:t>follows</w:t>
+      </w:r>
+      <w:r>
+        <w:t xml:space="preserve"> </w:t>
+      </w:r>
+      <w:r>
+        <w:rPr>
+          <w:b w:val="0"/>
+          <w:i w:val="0"/>
+        </w:rPr>
+        <w:t>the</w:t>
+      </w:r>
+      <w:r>
+        <w:t xml:space="preserve"> </w:t>
+      </w:r>
+      <w:r>
+        <w:rPr>
+          <w:b w:val="0"/>
+          <w:i w:val="0"/>
+        </w:rPr>
+        <w:t>Style</w:t>
+      </w:r>
+      <w:r>
+        <w:t xml:space="preserve"> </w:t>
+      </w:r>
+      <w:r>
+        <w:rPr>
+          <w:b w:val="0"/>
+          <w:i w:val="0"/>
+        </w:rPr>
+        <w:t>Log</w:t>
+      </w:r>
+      <w:r>
+        <w:t xml:space="preserve"> </w:t>
+      </w:r>
+      <w:r>
+        <w:rPr>
+          <w:b w:val="0"/>
+          <w:i w:val="0"/>
+        </w:rPr>
+        <w:t>and</w:t>
+      </w:r>
+      <w:r>
+        <w:t xml:space="preserve"> </w:t>
+      </w:r>
+      <w:r>
+        <w:rPr>
+          <w:b w:val="0"/>
+          <w:i w:val="0"/>
+        </w:rPr>
+        <w:t>is</w:t>
+      </w:r>
+      <w:r>
+        <w:t xml:space="preserve"> </w:t>
+      </w:r>
+      <w:r>
+        <w:rPr>
+          <w:b w:val="0"/>
+          <w:i w:val="0"/>
+        </w:rPr>
+        <w:t>mandatory.</w:t>
+      </w:r>
+      <w:r>
+        <w:t xml:space="preserve"> </w:t>
+      </w:r>
+      <w:r>
+        <w:rPr>
+          <w:b w:val="0"/>
+          <w:i w:val="0"/>
+        </w:rPr>
+        <w:t>It</w:t>
+      </w:r>
+      <w:r>
+        <w:t xml:space="preserve"> </w:t>
+      </w:r>
+      <w:r>
+        <w:rPr>
+          <w:b w:val="0"/>
+          <w:i w:val="0"/>
+        </w:rPr>
+        <w:t>is</w:t>
+      </w:r>
+      <w:r>
+        <w:t xml:space="preserve"> </w:t>
+      </w:r>
+      <w:r>
+        <w:rPr>
+          <w:b w:val="0"/>
+          <w:i w:val="0"/>
+        </w:rPr>
+        <w:t>the</w:t>
+      </w:r>
+      <w:r>
+        <w:t xml:space="preserve"> </w:t>
+      </w:r>
+      <w:r>
+        <w:rPr>
+          <w:b w:val="0"/>
+          <w:i w:val="0"/>
+        </w:rPr>
+        <w:t>evidence</w:t>
+      </w:r>
+      <w:r>
+        <w:t xml:space="preserve"> </w:t>
+      </w:r>
+      <w:r>
+        <w:rPr>
+          <w:b w:val="0"/>
+          <w:i w:val="0"/>
+        </w:rPr>
+        <w:t>mast</w:t>
+      </w:r>
+      <w:r>
+        <w:t xml:space="preserve"> </w:t>
+      </w:r>
+      <w:r>
+        <w:rPr>
+          <w:b w:val="0"/>
+          <w:i w:val="0"/>
+        </w:rPr>
+        <w:t>for</w:t>
+      </w:r>
+      <w:r>
+        <w:t xml:space="preserve"> </w:t>
+      </w:r>
+      <w:r>
+        <w:rPr>
+          <w:b w:val="0"/>
+          <w:i w:val="0"/>
+        </w:rPr>
+        <w:t>the</w:t>
+      </w:r>
+      <w:r>
+        <w:t xml:space="preserve"> </w:t>
+      </w:r>
+      <w:r>
+        <w:rPr>
+          <w:b w:val="0"/>
+          <w:i w:val="0"/>
+        </w:rPr>
+        <w:t>edit:</w:t>
+      </w:r>
+      <w:r>
+        <w:t xml:space="preserve"> </w:t>
+      </w:r>
+      <w:r>
+        <w:rPr>
+          <w:b w:val="0"/>
+          <w:i w:val="0"/>
+        </w:rPr>
+        <w:t>begin</w:t>
+      </w:r>
+      <w:r>
+        <w:t xml:space="preserve"> </w:t>
+      </w:r>
+      <w:r>
+        <w:rPr>
+          <w:b w:val="0"/>
+          <w:i w:val="0"/>
+        </w:rPr>
+        <w:t>with</w:t>
+      </w:r>
+      <w:r>
+        <w:t xml:space="preserve"> </w:t>
+      </w:r>
+      <w:r>
+        <w:rPr>
+          <w:b w:val="0"/>
+          <w:i w:val="0"/>
+        </w:rPr>
+        <w:t>the</w:t>
+      </w:r>
+      <w:r>
+        <w:t xml:space="preserve"> </w:t>
+      </w:r>
+      <w:r>
+        <w:rPr>
+          <w:b w:val="0"/>
+          <w:i w:val="0"/>
+        </w:rPr>
+        <w:t>selected</w:t>
+      </w:r>
+      <w:r>
+        <w:t xml:space="preserve"> </w:t>
+      </w:r>
+      <w:r>
+        <w:rPr>
+          <w:b w:val="0"/>
+          <w:i w:val="0"/>
+        </w:rPr>
+        <w:t>edition</w:t>
+      </w:r>
+      <w:r>
+        <w:t xml:space="preserve"> </w:t>
+      </w:r>
+      <w:r>
+        <w:rPr>
+          <w:b w:val="0"/>
+          <w:i w:val="0"/>
+        </w:rPr>
+        <w:t>and</w:t>
+      </w:r>
+      <w:r>
+        <w:t xml:space="preserve"> </w:t>
+      </w:r>
+      <w:r>
+        <w:rPr>
+          <w:b w:val="0"/>
+          <w:i w:val="0"/>
+        </w:rPr>
+        <w:t>the</w:t>
+      </w:r>
+      <w:r>
+        <w:t xml:space="preserve"> </w:t>
+      </w:r>
+      <w:r>
+        <w:rPr>
+          <w:b w:val="0"/>
+          <w:i w:val="0"/>
+        </w:rPr>
+        <w:t>exact</w:t>
+      </w:r>
+      <w:r>
+        <w:t xml:space="preserve"> </w:t>
+      </w:r>
+      <w:r>
+        <w:rPr>
+          <w:b w:val="0"/>
+          <w:i w:val="0"/>
+        </w:rPr>
+        <w:t>applicable</w:t>
+      </w:r>
+      <w:r>
+        <w:t xml:space="preserve"> </w:t>
+      </w:r>
+      <w:r>
+        <w:rPr>
+          <w:b w:val="0"/>
+          <w:i w:val="0"/>
+        </w:rPr>
+        <w:t>GUIDE</w:t>
+      </w:r>
+      <w:r>
+        <w:t xml:space="preserve"> </w:t>
+      </w:r>
+      <w:r>
+        <w:rPr>
+          <w:b w:val="0"/>
+          <w:i w:val="0"/>
+        </w:rPr>
+        <w:t>chapter</w:t>
+      </w:r>
+      <w:r>
+        <w:t xml:space="preserve"> </w:t>
+      </w:r>
+      <w:r>
+        <w:rPr>
+          <w:b w:val="0"/>
+          <w:i w:val="0"/>
+        </w:rPr>
+        <w:t>paths.</w:t>
       </w:r>
     </w:p>
     <w:p>
@@ -25420,67 +26803,1079 @@
         </w:pBdr>
       </w:pPr>
       <w:r>
-        <w:t>&lt;state_log&gt;</w:t>
+        <w:t>REFERENCES</w:t>
       </w:r>
       <w:r>
         <w:br/>
       </w:r>
-      <w:r/>
+      <w:r>
+        <w:t>290826_gpt_job-report | GUIDE: PROCESSES &gt; CONVERSIONS &gt; Numbers; OUTPUT &gt; FORMAT</w:t>
+      </w:r>
+    </w:p>
+    <w:p>
+      <w:pPr/>
+      <w:r>
+        <w:rPr>
+          <w:b w:val="0"/>
+          <w:i w:val="0"/>
+        </w:rPr>
+        <w:t>Name</w:t>
+      </w:r>
+      <w:r>
+        <w:t xml:space="preserve"> </w:t>
+      </w:r>
+      <w:r>
+        <w:rPr>
+          <w:b w:val="0"/>
+          <w:i w:val="0"/>
+        </w:rPr>
+        <w:t>only</w:t>
+      </w:r>
+      <w:r>
+        <w:t xml:space="preserve"> </w:t>
+      </w:r>
+      <w:r>
+        <w:rPr>
+          <w:b w:val="0"/>
+          <w:i w:val="0"/>
+        </w:rPr>
+        <w:t>chapters</w:t>
+      </w:r>
+      <w:r>
+        <w:t xml:space="preserve"> </w:t>
+      </w:r>
+      <w:r>
+        <w:rPr>
+          <w:b w:val="0"/>
+          <w:i w:val="0"/>
+        </w:rPr>
+        <w:t>actually</w:t>
+      </w:r>
+      <w:r>
+        <w:t xml:space="preserve"> </w:t>
+      </w:r>
+      <w:r>
+        <w:rPr>
+          <w:b w:val="0"/>
+          <w:i w:val="0"/>
+        </w:rPr>
+        <w:t>applicable</w:t>
+      </w:r>
+      <w:r>
+        <w:t xml:space="preserve"> </w:t>
+      </w:r>
+      <w:r>
+        <w:rPr>
+          <w:b w:val="0"/>
+          <w:i w:val="0"/>
+        </w:rPr>
+        <w:t>to</w:t>
+      </w:r>
+      <w:r>
+        <w:t xml:space="preserve"> </w:t>
+      </w:r>
+      <w:r>
+        <w:rPr>
+          <w:b w:val="0"/>
+          <w:i w:val="0"/>
+        </w:rPr>
+        <w:t>the</w:t>
+      </w:r>
+      <w:r>
+        <w:t xml:space="preserve"> </w:t>
+      </w:r>
+      <w:r>
+        <w:rPr>
+          <w:b w:val="0"/>
+          <w:i w:val="0"/>
+        </w:rPr>
+        <w:t>edit.</w:t>
+      </w:r>
+      <w:r>
+        <w:t xml:space="preserve"> </w:t>
+      </w:r>
+      <w:r>
+        <w:rPr>
+          <w:b w:val="0"/>
+          <w:i w:val="0"/>
+        </w:rPr>
+        <w:t>Do</w:t>
+      </w:r>
+      <w:r>
+        <w:t xml:space="preserve"> </w:t>
+      </w:r>
+      <w:r>
+        <w:rPr>
+          <w:b w:val="0"/>
+          <w:i w:val="0"/>
+        </w:rPr>
+        <w:t>not</w:t>
+      </w:r>
+      <w:r>
+        <w:t xml:space="preserve"> </w:t>
+      </w:r>
+      <w:r>
+        <w:rPr>
+          <w:b w:val="0"/>
+          <w:i w:val="0"/>
+        </w:rPr>
+        <w:t>list</w:t>
+      </w:r>
+      <w:r>
+        <w:t xml:space="preserve"> </w:t>
+      </w:r>
+      <w:r>
+        <w:rPr>
+          <w:b w:val="0"/>
+          <w:i w:val="0"/>
+        </w:rPr>
+        <w:t>the</w:t>
+      </w:r>
+      <w:r>
+        <w:t xml:space="preserve"> </w:t>
+      </w:r>
+      <w:r>
+        <w:rPr>
+          <w:b w:val="0"/>
+          <w:i w:val="0"/>
+        </w:rPr>
+        <w:t>entire</w:t>
+      </w:r>
+      <w:r>
+        <w:t xml:space="preserve"> </w:t>
+      </w:r>
+      <w:r>
+        <w:rPr>
+          <w:b w:val="0"/>
+          <w:i w:val="0"/>
+        </w:rPr>
+        <w:t>GUIDE.</w:t>
+      </w:r>
+    </w:p>
+    <w:p>
+      <w:pPr/>
+      <w:r>
+        <w:rPr>
+          <w:b w:val="0"/>
+          <w:i w:val="0"/>
+        </w:rPr>
+        <w:t>If</w:t>
+      </w:r>
+      <w:r>
+        <w:t xml:space="preserve"> </w:t>
+      </w:r>
+      <w:r>
+        <w:rPr>
+          <w:b w:val="0"/>
+          <w:i w:val="0"/>
+        </w:rPr>
+        <w:t>an</w:t>
+      </w:r>
+      <w:r>
+        <w:t xml:space="preserve"> </w:t>
+      </w:r>
+      <w:r>
+        <w:rPr>
+          <w:b w:val="0"/>
+          <w:i w:val="0"/>
+        </w:rPr>
+        <w:t>internal</w:t>
+      </w:r>
+      <w:r>
+        <w:t xml:space="preserve"> </w:t>
+      </w:r>
+      <w:r>
+        <w:rPr>
+          <w:b w:val="0"/>
+          <w:i w:val="0"/>
+        </w:rPr>
+        <w:t>DIRECTORY</w:t>
+      </w:r>
+      <w:r>
+        <w:t xml:space="preserve"> </w:t>
+      </w:r>
+      <w:r>
+        <w:rPr>
+          <w:b w:val="0"/>
+          <w:i w:val="0"/>
+        </w:rPr>
+        <w:t>lookup</w:t>
+      </w:r>
+      <w:r>
+        <w:t xml:space="preserve"> </w:t>
+      </w:r>
+      <w:r>
+        <w:rPr>
+          <w:b w:val="0"/>
+          <w:i w:val="0"/>
+        </w:rPr>
+        <w:t>was</w:t>
+      </w:r>
+      <w:r>
+        <w:t xml:space="preserve"> </w:t>
+      </w:r>
+      <w:r>
+        <w:rPr>
+          <w:b w:val="0"/>
+          <w:i w:val="0"/>
+        </w:rPr>
+        <w:t>triggered,</w:t>
+      </w:r>
+      <w:r>
+        <w:t xml:space="preserve"> </w:t>
+      </w:r>
+      <w:r>
+        <w:rPr>
+          <w:b w:val="0"/>
+          <w:i w:val="0"/>
+        </w:rPr>
+        <w:t>append:</w:t>
+      </w:r>
+    </w:p>
+    <w:p>
+      <w:pPr>
+        <w:pStyle w:val="BKPCode"/>
+        <w:keepLines/>
+        <w:spacing w:before="100" w:after="140"/>
+        <w:ind w:left="86" w:right="86"/>
+        <w:shd w:fill="F4F4F4"/>
+        <w:pBdr>
+          <w:top w:val="single" w:sz="10" w:space="7" w:color="000000"/>
+          <w:left w:val="single" w:sz="10" w:space="7" w:color="000000"/>
+          <w:bottom w:val="single" w:sz="10" w:space="7" w:color="000000"/>
+          <w:right w:val="single" w:sz="10" w:space="7" w:color="000000"/>
+        </w:pBdr>
+      </w:pPr>
+      <w:r>
+        <w:t>DIRECTORYQ [DDMMYY - slug]</w:t>
+      </w:r>
       <w:r>
         <w:br/>
       </w:r>
       <w:r>
-        <w:t>slug-as-filed</w:t>
+        <w:t>n | term | exact.path | held form, NOT LISTED or UNAVAILABLE</w:t>
+      </w:r>
+    </w:p>
+    <w:p>
+      <w:pPr/>
+      <w:r>
+        <w:rPr>
+          <w:rFonts w:ascii="Courier New" w:hAnsi="Courier New" w:eastAsia="Courier New"/>
+          <w:b w:val="0"/>
+          <w:i w:val="0"/>
+          <w:sz w:val="19"/>
+        </w:rPr>
+        <w:t>NOT LISTED</w:t>
+      </w:r>
+      <w:r>
+        <w:t xml:space="preserve"> </w:t>
+      </w:r>
+      <w:r>
+        <w:rPr>
+          <w:b w:val="0"/>
+          <w:i w:val="0"/>
+        </w:rPr>
+        <w:t>requires</w:t>
+      </w:r>
+      <w:r>
+        <w:t xml:space="preserve"> </w:t>
+      </w:r>
+      <w:r>
+        <w:rPr>
+          <w:b w:val="0"/>
+          <w:i w:val="0"/>
+        </w:rPr>
+        <w:t>a</w:t>
+      </w:r>
+      <w:r>
+        <w:t xml:space="preserve"> </w:t>
+      </w:r>
+      <w:r>
+        <w:rPr>
+          <w:b w:val="0"/>
+          <w:i w:val="0"/>
+        </w:rPr>
+        <w:t>successful</w:t>
+      </w:r>
+      <w:r>
+        <w:t xml:space="preserve"> </w:t>
+      </w:r>
+      <w:r>
+        <w:rPr>
+          <w:b w:val="0"/>
+          <w:i w:val="0"/>
+        </w:rPr>
+        <w:t>check</w:t>
+      </w:r>
+      <w:r>
+        <w:t xml:space="preserve"> </w:t>
+      </w:r>
+      <w:r>
+        <w:rPr>
+          <w:b w:val="0"/>
+          <w:i w:val="0"/>
+        </w:rPr>
+        <w:t>with</w:t>
+      </w:r>
+      <w:r>
+        <w:t xml:space="preserve"> </w:t>
+      </w:r>
+      <w:r>
+        <w:rPr>
+          <w:b w:val="0"/>
+          <w:i w:val="0"/>
+        </w:rPr>
+        <w:t>no</w:t>
+      </w:r>
+      <w:r>
+        <w:t xml:space="preserve"> </w:t>
+      </w:r>
+      <w:r>
+        <w:rPr>
+          <w:b w:val="0"/>
+          <w:i w:val="0"/>
+        </w:rPr>
+        <w:t>entry;</w:t>
+      </w:r>
+      <w:r>
+        <w:t xml:space="preserve"> </w:t>
+      </w:r>
+      <w:r>
+        <w:rPr>
+          <w:rFonts w:ascii="Courier New" w:hAnsi="Courier New" w:eastAsia="Courier New"/>
+          <w:b w:val="0"/>
+          <w:i w:val="0"/>
+          <w:sz w:val="19"/>
+        </w:rPr>
+        <w:t>UNAVAILABLE</w:t>
+      </w:r>
+      <w:r>
+        <w:t xml:space="preserve"> </w:t>
+      </w:r>
+      <w:r>
+        <w:rPr>
+          <w:b w:val="0"/>
+          <w:i w:val="0"/>
+        </w:rPr>
+        <w:t>means</w:t>
+      </w:r>
+      <w:r>
+        <w:t xml:space="preserve"> </w:t>
+      </w:r>
+      <w:r>
+        <w:rPr>
+          <w:b w:val="0"/>
+          <w:i w:val="0"/>
+        </w:rPr>
+        <w:t>no</w:t>
+      </w:r>
+      <w:r>
+        <w:t xml:space="preserve"> </w:t>
+      </w:r>
+      <w:r>
+        <w:rPr>
+          <w:b w:val="0"/>
+          <w:i w:val="0"/>
+        </w:rPr>
+        <w:t>check</w:t>
+      </w:r>
+      <w:r>
+        <w:t xml:space="preserve"> </w:t>
+      </w:r>
+      <w:r>
+        <w:rPr>
+          <w:b w:val="0"/>
+          <w:i w:val="0"/>
+        </w:rPr>
+        <w:t>was</w:t>
+      </w:r>
+      <w:r>
+        <w:t xml:space="preserve"> </w:t>
+      </w:r>
+      <w:r>
+        <w:rPr>
+          <w:b w:val="0"/>
+          <w:i w:val="0"/>
+        </w:rPr>
+        <w:t>possible.</w:t>
+      </w:r>
+      <w:r>
+        <w:t xml:space="preserve"> </w:t>
+      </w:r>
+      <w:r>
+        <w:rPr>
+          <w:b w:val="0"/>
+          <w:i w:val="0"/>
+        </w:rPr>
+        <w:t>If</w:t>
+      </w:r>
+      <w:r>
+        <w:t xml:space="preserve"> </w:t>
+      </w:r>
+      <w:r>
+        <w:rPr>
+          <w:b w:val="0"/>
+          <w:i w:val="0"/>
+        </w:rPr>
+        <w:t>no</w:t>
+      </w:r>
+      <w:r>
+        <w:t xml:space="preserve"> </w:t>
+      </w:r>
+      <w:r>
+        <w:rPr>
+          <w:b w:val="0"/>
+          <w:i w:val="0"/>
+        </w:rPr>
+        <w:t>internal</w:t>
+      </w:r>
+      <w:r>
+        <w:t xml:space="preserve"> </w:t>
+      </w:r>
+      <w:r>
+        <w:rPr>
+          <w:b w:val="0"/>
+          <w:i w:val="0"/>
+        </w:rPr>
+        <w:t>lookup</w:t>
+      </w:r>
+      <w:r>
+        <w:t xml:space="preserve"> </w:t>
+      </w:r>
+      <w:r>
+        <w:rPr>
+          <w:b w:val="0"/>
+          <w:i w:val="0"/>
+        </w:rPr>
+        <w:t>was</w:t>
+      </w:r>
+      <w:r>
+        <w:t xml:space="preserve"> </w:t>
+      </w:r>
+      <w:r>
+        <w:rPr>
+          <w:b w:val="0"/>
+          <w:i w:val="0"/>
+        </w:rPr>
+        <w:t>triggered,</w:t>
+      </w:r>
+      <w:r>
+        <w:t xml:space="preserve"> </w:t>
+      </w:r>
+      <w:r>
+        <w:rPr>
+          <w:b w:val="0"/>
+          <w:i w:val="0"/>
+        </w:rPr>
+        <w:t>omit</w:t>
+      </w:r>
+      <w:r>
+        <w:t xml:space="preserve"> </w:t>
+      </w:r>
+      <w:r>
+        <w:rPr>
+          <w:b w:val="0"/>
+          <w:i w:val="0"/>
+        </w:rPr>
+        <w:t>DIRECTORYQ</w:t>
+      </w:r>
+      <w:r>
+        <w:t xml:space="preserve"> </w:t>
+      </w:r>
+      <w:r>
+        <w:rPr>
+          <w:b w:val="0"/>
+          <w:i w:val="0"/>
+        </w:rPr>
+        <w:t>entirely.</w:t>
+      </w:r>
+    </w:p>
+    <w:p>
+      <w:pPr/>
+      <w:r>
+        <w:rPr>
+          <w:b w:val="0"/>
+          <w:i w:val="0"/>
+        </w:rPr>
+        <w:t>If</w:t>
+      </w:r>
+      <w:r>
+        <w:t xml:space="preserve"> </w:t>
+      </w:r>
+      <w:r>
+        <w:rPr>
+          <w:b w:val="0"/>
+          <w:i w:val="0"/>
+        </w:rPr>
+        <w:t>an</w:t>
+      </w:r>
+      <w:r>
+        <w:t xml:space="preserve"> </w:t>
+      </w:r>
+      <w:r>
+        <w:rPr>
+          <w:b w:val="0"/>
+          <w:i w:val="0"/>
+        </w:rPr>
+        <w:t>external</w:t>
+      </w:r>
+      <w:r>
+        <w:t xml:space="preserve"> </w:t>
+      </w:r>
+      <w:r>
+        <w:rPr>
+          <w:b w:val="0"/>
+          <w:i w:val="0"/>
+        </w:rPr>
+        <w:t>search</w:t>
+      </w:r>
+      <w:r>
+        <w:t xml:space="preserve"> </w:t>
+      </w:r>
+      <w:r>
+        <w:rPr>
+          <w:b w:val="0"/>
+          <w:i w:val="0"/>
+        </w:rPr>
+        <w:t>was</w:t>
+      </w:r>
+      <w:r>
+        <w:t xml:space="preserve"> </w:t>
+      </w:r>
+      <w:r>
+        <w:rPr>
+          <w:b w:val="0"/>
+          <w:i w:val="0"/>
+        </w:rPr>
+        <w:t>executed,</w:t>
+      </w:r>
+      <w:r>
+        <w:t xml:space="preserve"> </w:t>
+      </w:r>
+      <w:r>
+        <w:rPr>
+          <w:b w:val="0"/>
+          <w:i w:val="0"/>
+        </w:rPr>
+        <w:t>append</w:t>
+      </w:r>
+      <w:r>
+        <w:t xml:space="preserve"> </w:t>
+      </w:r>
+      <w:r>
+        <w:rPr>
+          <w:b w:val="0"/>
+          <w:i w:val="0"/>
+        </w:rPr>
+        <w:t>the</w:t>
+      </w:r>
+      <w:r>
+        <w:t xml:space="preserve"> </w:t>
+      </w:r>
+      <w:r>
+        <w:rPr>
+          <w:b w:val="0"/>
+          <w:i w:val="0"/>
+        </w:rPr>
+        <w:t>prescribed</w:t>
+      </w:r>
+      <w:r>
+        <w:t xml:space="preserve"> </w:t>
+      </w:r>
+      <w:r>
+        <w:rPr>
+          <w:b w:val="0"/>
+          <w:i w:val="0"/>
+        </w:rPr>
+        <w:t>SEARCHQ</w:t>
+      </w:r>
+      <w:r>
+        <w:t xml:space="preserve"> </w:t>
+      </w:r>
+      <w:r>
+        <w:rPr>
+          <w:b w:val="0"/>
+          <w:i w:val="0"/>
+        </w:rPr>
+        <w:t>block.</w:t>
+      </w:r>
+      <w:r>
+        <w:t xml:space="preserve"> </w:t>
+      </w:r>
+      <w:r>
+        <w:rPr>
+          <w:b w:val="0"/>
+          <w:i w:val="0"/>
+        </w:rPr>
+        <w:t>If</w:t>
+      </w:r>
+      <w:r>
+        <w:t xml:space="preserve"> </w:t>
+      </w:r>
+      <w:r>
+        <w:rPr>
+          <w:b w:val="0"/>
+          <w:i w:val="0"/>
+        </w:rPr>
+        <w:t>none</w:t>
+      </w:r>
+      <w:r>
+        <w:t xml:space="preserve"> </w:t>
+      </w:r>
+      <w:r>
+        <w:rPr>
+          <w:b w:val="0"/>
+          <w:i w:val="0"/>
+        </w:rPr>
+        <w:t>was</w:t>
+      </w:r>
+      <w:r>
+        <w:t xml:space="preserve"> </w:t>
+      </w:r>
+      <w:r>
+        <w:rPr>
+          <w:b w:val="0"/>
+          <w:i w:val="0"/>
+        </w:rPr>
+        <w:t>executed,</w:t>
+      </w:r>
+      <w:r>
+        <w:t xml:space="preserve"> </w:t>
+      </w:r>
+      <w:r>
+        <w:rPr>
+          <w:b w:val="0"/>
+          <w:i w:val="0"/>
+        </w:rPr>
+        <w:t>omit</w:t>
+      </w:r>
+      <w:r>
+        <w:t xml:space="preserve"> </w:t>
+      </w:r>
+      <w:r>
+        <w:rPr>
+          <w:b w:val="0"/>
+          <w:i w:val="0"/>
+        </w:rPr>
+        <w:t>SEARCHQ</w:t>
+      </w:r>
+      <w:r>
+        <w:t xml:space="preserve"> </w:t>
+      </w:r>
+      <w:r>
+        <w:rPr>
+          <w:b w:val="0"/>
+          <w:i w:val="0"/>
+        </w:rPr>
+        <w:t>entirely.</w:t>
+      </w:r>
+    </w:p>
+    <w:p>
+      <w:bookmarkStart w:id="9022" w:name="_bkp_toc_22"/>
+      <w:pPr>
+        <w:pStyle w:val="Heading3"/>
+      </w:pPr>
+      <w:r>
+        <w:rPr>
+          <w:b w:val="0"/>
+          <w:i w:val="0"/>
+        </w:rPr>
+        <w:t>UNRESOLVED</w:t>
+      </w:r>
+      <w:bookmarkEnd w:id="9022"/>
+    </w:p>
+    <w:p>
+      <w:pPr/>
+      <w:r>
+        <w:rPr>
+          <w:b w:val="0"/>
+          <w:i w:val="0"/>
+        </w:rPr>
+        <w:t>Add</w:t>
+      </w:r>
+      <w:r>
+        <w:t xml:space="preserve"> </w:t>
+      </w:r>
+      <w:r>
+        <w:rPr>
+          <w:b w:val="0"/>
+          <w:i w:val="0"/>
+        </w:rPr>
+        <w:t>UNRESOLVED</w:t>
+      </w:r>
+      <w:r>
+        <w:t xml:space="preserve"> </w:t>
+      </w:r>
+      <w:r>
+        <w:rPr>
+          <w:b w:val="0"/>
+          <w:i w:val="0"/>
+        </w:rPr>
+        <w:t>only</w:t>
+      </w:r>
+      <w:r>
+        <w:t xml:space="preserve"> </w:t>
+      </w:r>
+      <w:r>
+        <w:rPr>
+          <w:b w:val="0"/>
+          <w:i w:val="0"/>
+        </w:rPr>
+        <w:t>when</w:t>
+      </w:r>
+      <w:r>
+        <w:t xml:space="preserve"> </w:t>
+      </w:r>
+      <w:r>
+        <w:rPr>
+          <w:b w:val="0"/>
+          <w:i w:val="0"/>
+        </w:rPr>
+        <w:t>the</w:t>
+      </w:r>
+      <w:r>
+        <w:t xml:space="preserve"> </w:t>
+      </w:r>
+      <w:r>
+        <w:rPr>
+          <w:b w:val="0"/>
+          <w:i w:val="0"/>
+        </w:rPr>
+        <w:t>Job</w:t>
+      </w:r>
+      <w:r>
+        <w:t xml:space="preserve"> </w:t>
+      </w:r>
+      <w:r>
+        <w:rPr>
+          <w:b w:val="0"/>
+          <w:i w:val="0"/>
+        </w:rPr>
+        <w:t>Report</w:t>
+      </w:r>
+      <w:r>
+        <w:t xml:space="preserve"> </w:t>
+      </w:r>
+      <w:r>
+        <w:rPr>
+          <w:b w:val="0"/>
+          <w:i w:val="0"/>
+        </w:rPr>
+        <w:t>contains</w:t>
+      </w:r>
+      <w:r>
+        <w:t xml:space="preserve"> </w:t>
+      </w:r>
+      <w:r>
+        <w:rPr>
+          <w:b w:val="0"/>
+          <w:i w:val="0"/>
+        </w:rPr>
+        <w:t>an</w:t>
+      </w:r>
+      <w:r>
+        <w:t xml:space="preserve"> </w:t>
+      </w:r>
+      <w:r>
+        <w:rPr>
+          <w:b w:val="0"/>
+          <w:i w:val="0"/>
+        </w:rPr>
+        <w:t>aspect</w:t>
+      </w:r>
+      <w:r>
+        <w:t xml:space="preserve"> </w:t>
+      </w:r>
+      <w:r>
+        <w:rPr>
+          <w:b w:val="0"/>
+          <w:i w:val="0"/>
+        </w:rPr>
+        <w:t>requiring</w:t>
+      </w:r>
+      <w:r>
+        <w:t xml:space="preserve"> </w:t>
+      </w:r>
+      <w:r>
+        <w:rPr>
+          <w:b w:val="0"/>
+          <w:i w:val="0"/>
+        </w:rPr>
+        <w:t>follow-up.</w:t>
+      </w:r>
+      <w:r>
+        <w:t xml:space="preserve"> </w:t>
+      </w:r>
+      <w:r>
+        <w:rPr>
+          <w:b w:val="0"/>
+          <w:i w:val="0"/>
+        </w:rPr>
+        <w:t>State</w:t>
+      </w:r>
+      <w:r>
+        <w:t xml:space="preserve"> </w:t>
+      </w:r>
+      <w:r>
+        <w:rPr>
+          <w:b w:val="0"/>
+          <w:i w:val="0"/>
+        </w:rPr>
+        <w:t>the</w:t>
+      </w:r>
+      <w:r>
+        <w:t xml:space="preserve"> </w:t>
+      </w:r>
+      <w:r>
+        <w:rPr>
+          <w:b w:val="0"/>
+          <w:i w:val="0"/>
+        </w:rPr>
+        <w:t>required</w:t>
+      </w:r>
+      <w:r>
+        <w:t xml:space="preserve"> </w:t>
+      </w:r>
+      <w:r>
+        <w:rPr>
+          <w:b w:val="0"/>
+          <w:i w:val="0"/>
+        </w:rPr>
+        <w:t>action</w:t>
+      </w:r>
+      <w:r>
+        <w:t xml:space="preserve"> </w:t>
+      </w:r>
+      <w:r>
+        <w:rPr>
+          <w:b w:val="0"/>
+          <w:i w:val="0"/>
+        </w:rPr>
+        <w:t>cold,</w:t>
+      </w:r>
+      <w:r>
+        <w:t xml:space="preserve"> </w:t>
+      </w:r>
+      <w:r>
+        <w:rPr>
+          <w:b w:val="0"/>
+          <w:i w:val="0"/>
+        </w:rPr>
+        <w:t>with</w:t>
+      </w:r>
+      <w:r>
+        <w:t xml:space="preserve"> </w:t>
+      </w:r>
+      <w:r>
+        <w:rPr>
+          <w:b w:val="0"/>
+          <w:i w:val="0"/>
+        </w:rPr>
+        <w:t>no</w:t>
+      </w:r>
+      <w:r>
+        <w:t xml:space="preserve"> </w:t>
+      </w:r>
+      <w:r>
+        <w:rPr>
+          <w:b w:val="0"/>
+          <w:i w:val="0"/>
+        </w:rPr>
+        <w:t>dependence</w:t>
+      </w:r>
+      <w:r>
+        <w:t xml:space="preserve"> </w:t>
+      </w:r>
+      <w:r>
+        <w:rPr>
+          <w:b w:val="0"/>
+          <w:i w:val="0"/>
+        </w:rPr>
+        <w:t>on</w:t>
+      </w:r>
+      <w:r>
+        <w:t xml:space="preserve"> </w:t>
+      </w:r>
+      <w:r>
+        <w:rPr>
+          <w:b w:val="0"/>
+          <w:i w:val="0"/>
+        </w:rPr>
+        <w:t>surrounding</w:t>
+      </w:r>
+      <w:r>
+        <w:t xml:space="preserve"> </w:t>
+      </w:r>
+      <w:r>
+        <w:rPr>
+          <w:b w:val="0"/>
+          <w:i w:val="0"/>
+        </w:rPr>
+        <w:t>conversation.</w:t>
+      </w:r>
+      <w:r>
+        <w:t xml:space="preserve"> </w:t>
+      </w:r>
+      <w:r>
+        <w:rPr>
+          <w:b w:val="0"/>
+          <w:i w:val="0"/>
+        </w:rPr>
+        <w:t>Omit</w:t>
+      </w:r>
+      <w:r>
+        <w:t xml:space="preserve"> </w:t>
+      </w:r>
+      <w:r>
+        <w:rPr>
+          <w:b w:val="0"/>
+          <w:i w:val="0"/>
+        </w:rPr>
+        <w:t>the</w:t>
+      </w:r>
+      <w:r>
+        <w:t xml:space="preserve"> </w:t>
+      </w:r>
+      <w:r>
+        <w:rPr>
+          <w:b w:val="0"/>
+          <w:i w:val="0"/>
+        </w:rPr>
+        <w:t>module</w:t>
+      </w:r>
+      <w:r>
+        <w:t xml:space="preserve"> </w:t>
+      </w:r>
+      <w:r>
+        <w:rPr>
+          <w:b w:val="0"/>
+          <w:i w:val="0"/>
+        </w:rPr>
+        <w:t>when</w:t>
+      </w:r>
+      <w:r>
+        <w:t xml:space="preserve"> </w:t>
+      </w:r>
+      <w:r>
+        <w:rPr>
+          <w:b w:val="0"/>
+          <w:i w:val="0"/>
+        </w:rPr>
+        <w:t>the</w:t>
+      </w:r>
+      <w:r>
+        <w:t xml:space="preserve"> </w:t>
+      </w:r>
+      <w:r>
+        <w:rPr>
+          <w:b w:val="0"/>
+          <w:i w:val="0"/>
+        </w:rPr>
+        <w:t>report</w:t>
+      </w:r>
+      <w:r>
+        <w:t xml:space="preserve"> </w:t>
+      </w:r>
+      <w:r>
+        <w:rPr>
+          <w:b w:val="0"/>
+          <w:i w:val="0"/>
+        </w:rPr>
+        <w:t>can</w:t>
+      </w:r>
+      <w:r>
+        <w:t xml:space="preserve"> </w:t>
+      </w:r>
+      <w:r>
+        <w:rPr>
+          <w:b w:val="0"/>
+          <w:i w:val="0"/>
+        </w:rPr>
+        <w:t>be</w:t>
+      </w:r>
+      <w:r>
+        <w:t xml:space="preserve"> </w:t>
+      </w:r>
+      <w:r>
+        <w:rPr>
+          <w:b w:val="0"/>
+          <w:i w:val="0"/>
+        </w:rPr>
+        <w:t>received</w:t>
+      </w:r>
+      <w:r>
+        <w:t xml:space="preserve"> </w:t>
+      </w:r>
+      <w:r>
+        <w:rPr>
+          <w:b w:val="0"/>
+          <w:i w:val="0"/>
+        </w:rPr>
+        <w:t>and</w:t>
+      </w:r>
+      <w:r>
+        <w:t xml:space="preserve"> </w:t>
+      </w:r>
+      <w:r>
+        <w:rPr>
+          <w:b w:val="0"/>
+          <w:i w:val="0"/>
+        </w:rPr>
+        <w:t>moved</w:t>
+      </w:r>
+      <w:r>
+        <w:t xml:space="preserve"> </w:t>
+      </w:r>
+      <w:r>
+        <w:rPr>
+          <w:b w:val="0"/>
+          <w:i w:val="0"/>
+        </w:rPr>
+        <w:t>on</w:t>
+      </w:r>
+      <w:r>
+        <w:t xml:space="preserve"> </w:t>
+      </w:r>
+      <w:r>
+        <w:rPr>
+          <w:b w:val="0"/>
+          <w:i w:val="0"/>
+        </w:rPr>
+        <w:t>without</w:t>
+      </w:r>
+      <w:r>
+        <w:t xml:space="preserve"> </w:t>
+      </w:r>
+      <w:r>
+        <w:rPr>
+          <w:b w:val="0"/>
+          <w:i w:val="0"/>
+        </w:rPr>
+        <w:t>issue.</w:t>
+      </w:r>
+    </w:p>
+    <w:p>
+      <w:pPr>
+        <w:pStyle w:val="BKPCode"/>
+        <w:keepLines/>
+        <w:spacing w:before="100" w:after="140"/>
+        <w:ind w:left="86" w:right="86"/>
+        <w:shd w:fill="F4F4F4"/>
+        <w:pBdr>
+          <w:top w:val="single" w:sz="10" w:space="7" w:color="000000"/>
+          <w:left w:val="single" w:sz="10" w:space="7" w:color="000000"/>
+          <w:bottom w:val="single" w:sz="10" w:space="7" w:color="000000"/>
+          <w:right w:val="single" w:sz="10" w:space="7" w:color="000000"/>
+        </w:pBdr>
+      </w:pPr>
+      <w:r>
+        <w:t>UNRESOLVED</w:t>
       </w:r>
       <w:r>
         <w:br/>
       </w:r>
-      <w:r/>
-      <w:r>
-        <w:br/>
-      </w:r>
-      <w:r>
-        <w:t>editing_complete | final_proof | legal_hold</w:t>
-      </w:r>
-      <w:r>
-        <w:br/>
-      </w:r>
-      <w:r/>
-      <w:r>
-        <w:br/>
-      </w:r>
-      <w:r>
-        <w:t>[One clinical sentence summarising the main intervention or status.]</w:t>
-      </w:r>
-      <w:r>
-        <w:br/>
-      </w:r>
-      <w:r/>
-      <w:r>
-        <w:br/>
-      </w:r>
-      <w:r>
-        <w:t>Unresolved:</w:t>
-      </w:r>
-      <w:r>
-        <w:br/>
-      </w:r>
-      <w:r/>
-      <w:r>
-        <w:br/>
-      </w:r>
-      <w:r>
-        <w:t>[Flags or anomalies held for the supervisor; or "none".]</w:t>
-      </w:r>
-      <w:r>
-        <w:br/>
-      </w:r>
-      <w:r/>
-      <w:r>
-        <w:br/>
-      </w:r>
-      <w:r>
-        <w:t>&lt;/state_log&gt;</w:t>
+      <w:r>
+        <w:t>Confirm paragraph 4 attribution before release.</w:t>
       </w:r>
     </w:p>
     <w:p>
@@ -25616,6 +28011,7 @@
       </w:r>
     </w:p>
     <w:p>
+      <w:bookmarkStart w:id="9023" w:name="_bkp_toc_23"/>
       <w:pPr>
         <w:pStyle w:val="Heading1"/>
         <w:spacing w:after="0"/>
@@ -25624,6 +28020,7 @@
       <w:r>
         <w:t>STATUS</w:t>
       </w:r>
+      <w:bookmarkEnd w:id="9023"/>
     </w:p>
     <w:p>
       <w:pPr>
@@ -25635,12 +28032,14 @@
       </w:r>
     </w:p>
     <w:p>
+      <w:bookmarkStart w:id="9024" w:name="_bkp_toc_24"/>
       <w:pPr>
         <w:pStyle w:val="Heading2"/>
       </w:pPr>
       <w:r>
         <w:t>APEX FIGURES</w:t>
       </w:r>
+      <w:bookmarkEnd w:id="9024"/>
     </w:p>
     <w:p>
       <w:r>
@@ -25723,12 +28122,14 @@
       </w:r>
     </w:p>
     <w:p>
+      <w:bookmarkStart w:id="9025" w:name="_bkp_toc_25"/>
       <w:pPr>
         <w:pStyle w:val="Heading2"/>
       </w:pPr>
       <w:r>
         <w:t>SECOND TIER</w:t>
       </w:r>
+      <w:bookmarkEnd w:id="9025"/>
     </w:p>
     <w:p>
       <w:r>
@@ -25830,12 +28231,14 @@
       </w:r>
     </w:p>
     <w:p>
+      <w:bookmarkStart w:id="9026" w:name="_bkp_toc_26"/>
       <w:pPr>
         <w:pStyle w:val="Heading3"/>
       </w:pPr>
       <w:r>
         <w:t>MORTALITIES AND SUCCESSIONS</w:t>
       </w:r>
+      <w:bookmarkEnd w:id="9026"/>
     </w:p>
     <w:p>
       <w:r>
@@ -25959,12 +28362,14 @@
       </w:r>
     </w:p>
     <w:p>
+      <w:bookmarkStart w:id="9027" w:name="_bkp_toc_27"/>
       <w:pPr>
         <w:pStyle w:val="Heading3"/>
       </w:pPr>
       <w:r>
         <w:t>CORPORATE LEADERSHIP CHANGES</w:t>
       </w:r>
+      <w:bookmarkEnd w:id="9027"/>
     </w:p>
     <w:p>
       <w:r>
@@ -25989,12 +28394,14 @@
       </w:r>
     </w:p>
     <w:p>
+      <w:bookmarkStart w:id="9028" w:name="_bkp_toc_28"/>
       <w:pPr>
         <w:pStyle w:val="Heading2"/>
       </w:pPr>
       <w:r>
         <w:t>GLOBAL FIGURES</w:t>
       </w:r>
+      <w:bookmarkEnd w:id="9028"/>
     </w:p>
     <w:p>
       <w:r>
@@ -26207,6 +28614,7 @@
       </w:r>
     </w:p>
     <w:p>
+      <w:bookmarkStart w:id="9029" w:name="_bkp_toc_29"/>
       <w:pPr>
         <w:pStyle w:val="Heading1"/>
         <w:spacing w:after="0"/>
@@ -26215,6 +28623,7 @@
       <w:r>
         <w:t>REFS</w:t>
       </w:r>
+      <w:bookmarkEnd w:id="9029"/>
     </w:p>
     <w:p>
       <w:pPr>
@@ -26226,20 +28635,24 @@
       </w:r>
     </w:p>
     <w:p>
+      <w:bookmarkStart w:id="9030" w:name="_bkp_toc_30"/>
       <w:pPr>
         <w:pStyle w:val="Heading2"/>
       </w:pPr>
       <w:r>
         <w:t>COUNTRIES</w:t>
       </w:r>
-    </w:p>
-    <w:p>
+      <w:bookmarkEnd w:id="9030"/>
+    </w:p>
+    <w:p>
+      <w:bookmarkStart w:id="9031" w:name="_bkp_toc_31"/>
       <w:pPr>
         <w:pStyle w:val="Heading3"/>
       </w:pPr>
       <w:r>
         <w:t>PREFERRED FORMS</w:t>
       </w:r>
+      <w:bookmarkEnd w:id="9031"/>
     </w:p>
     <w:p>
       <w:r>
@@ -26341,12 +28754,14 @@
       </w:r>
     </w:p>
     <w:p>
+      <w:bookmarkStart w:id="9032" w:name="_bkp_toc_32"/>
       <w:pPr>
         <w:pStyle w:val="Heading3"/>
       </w:pPr>
       <w:r>
         <w:t>ADJECTIVAL / DEMONYM TRAPS</w:t>
       </w:r>
+      <w:bookmarkEnd w:id="9032"/>
     </w:p>
     <w:p>
       <w:r>
@@ -26448,12 +28863,14 @@
       </w:r>
     </w:p>
     <w:p>
+      <w:bookmarkStart w:id="9033" w:name="_bkp_toc_33"/>
       <w:pPr>
         <w:pStyle w:val="Heading3"/>
       </w:pPr>
       <w:r>
         <w:t>CAPITALS AND COUNTRY STRUCTURE</w:t>
       </w:r>
+      <w:bookmarkEnd w:id="9033"/>
     </w:p>
     <w:p>
       <w:r>
@@ -26588,12 +29005,14 @@
       </w:r>
     </w:p>
     <w:p>
+      <w:bookmarkStart w:id="9034" w:name="_bkp_toc_34"/>
       <w:pPr>
         <w:pStyle w:val="Heading3"/>
       </w:pPr>
       <w:r>
         <w:t>HEADLINE ABBREVIATION FORMS</w:t>
       </w:r>
+      <w:bookmarkEnd w:id="9034"/>
     </w:p>
     <w:p>
       <w:r>
@@ -26695,12 +29114,14 @@
       </w:r>
     </w:p>
     <w:p>
+      <w:bookmarkStart w:id="9035" w:name="_bkp_toc_35"/>
       <w:pPr>
         <w:pStyle w:val="Heading2"/>
       </w:pPr>
       <w:r>
         <w:t>FOREIGN PLACES</w:t>
       </w:r>
+      <w:bookmarkEnd w:id="9035"/>
     </w:p>
     <w:p>
       <w:r>
@@ -27165,12 +29586,14 @@
       </w:r>
     </w:p>
     <w:p>
+      <w:bookmarkStart w:id="9036" w:name="_bkp_toc_36"/>
       <w:pPr>
         <w:pStyle w:val="Heading2"/>
       </w:pPr>
       <w:r>
         <w:t>THAI PLACES</w:t>
       </w:r>
+      <w:bookmarkEnd w:id="9036"/>
     </w:p>
     <w:p>
       <w:r>
@@ -27211,12 +29634,14 @@
       </w:r>
     </w:p>
     <w:p>
+      <w:bookmarkStart w:id="9037" w:name="_bkp_toc_37"/>
       <w:pPr>
         <w:pStyle w:val="Heading3"/>
       </w:pPr>
       <w:r>
         <w:t>PROVINCES</w:t>
       </w:r>
+      <w:bookmarkEnd w:id="9037"/>
     </w:p>
     <w:p>
       <w:r>
@@ -28066,12 +30491,14 @@
       </w:r>
     </w:p>
     <w:p>
+      <w:bookmarkStart w:id="9038" w:name="_bkp_toc_38"/>
       <w:pPr>
         <w:pStyle w:val="Heading2"/>
       </w:pPr>
       <w:r>
         <w:t>ORGANISATIONS</w:t>
       </w:r>
+      <w:bookmarkEnd w:id="9038"/>
     </w:p>
     <w:p>
       <w:r>
@@ -28283,12 +30710,14 @@
       </w:r>
     </w:p>
     <w:p>
+      <w:bookmarkStart w:id="9039" w:name="_bkp_toc_39"/>
       <w:pPr>
         <w:pStyle w:val="Heading2"/>
       </w:pPr>
       <w:r>
         <w:t>VOCABULARY &amp; SPELLING</w:t>
       </w:r>
+      <w:bookmarkEnd w:id="9039"/>
     </w:p>
     <w:p>
       <w:r>
@@ -28296,12 +30725,14 @@
       </w:r>
     </w:p>
     <w:p>
+      <w:bookmarkStart w:id="9040" w:name="_bkp_toc_40"/>
       <w:pPr>
         <w:pStyle w:val="Heading3"/>
       </w:pPr>
       <w:r>
         <w:t>NUMBERS AND SYMBOLS</w:t>
       </w:r>
+      <w:bookmarkEnd w:id="9040"/>
     </w:p>
     <w:p>
       <w:r>
@@ -28337,12 +30768,14 @@
       </w:r>
     </w:p>
     <w:p>
+      <w:bookmarkStart w:id="9041" w:name="_bkp_toc_41"/>
       <w:pPr>
         <w:pStyle w:val="Heading3"/>
       </w:pPr>
       <w:r>
         <w:t>UK VS US TRAPS</w:t>
       </w:r>
+      <w:bookmarkEnd w:id="9041"/>
     </w:p>
     <w:p>
       <w:r>
@@ -28510,12 +30943,14 @@
       </w:r>
     </w:p>
     <w:p>
+      <w:bookmarkStart w:id="9042" w:name="_bkp_toc_42"/>
       <w:pPr>
         <w:pStyle w:val="Heading3"/>
       </w:pPr>
       <w:r>
         <w:t>VOCABULARY RULINGS</w:t>
       </w:r>
+      <w:bookmarkEnd w:id="9042"/>
     </w:p>
     <w:p>
       <w:r>
@@ -29249,7 +31684,7 @@
         <w:color w:val="A8A8A8"/>
         <w:sz w:val="20"/>
       </w:rPr>
-      <w:t>210826_gpt_compact | go.fuzzylogic.page/dir</w:t>
+      <w:t>290826_gpt_job-report | go.fuzzylogic.page/dir</w:t>
     </w:r>
   </w:p>
 </w:hdr>
@@ -29330,7 +31765,7 @@
         <w:color w:val="A8A8A8"/>
         <w:sz w:val="20"/>
       </w:rPr>
-      <w:t>210826_gpt_compact | go.fuzzylogic.page/dir</w:t>
+      <w:t>290826_gpt_job-report | go.fuzzylogic.page/dir</w:t>
     </w:r>
   </w:p>
 </w:hdr>
@@ -29441,7 +31876,7 @@
         <w:color w:val="A8A8A8"/>
         <w:sz w:val="20"/>
       </w:rPr>
-      <w:t>210826_gpt_compact | go.fuzzylogic.page/guide</w:t>
+      <w:t>290826_gpt_job-report | go.fuzzylogic.page/guide</w:t>
     </w:r>
   </w:p>
 </w:hdr>

</xml_diff>